<commit_message>
Some updates of documentations
</commit_message>
<xml_diff>
--- a/Documentation.docx
+++ b/Documentation.docx
@@ -306,7 +306,7 @@
                     </pic:cNvPicPr>
                   </pic:nvPicPr>
                   <pic:blipFill>
-                    <a:blip r:embed="rId6">
+                    <a:blip r:embed="rId8">
                       <a:extLst>
                         <a:ext uri="{28A0092B-C50C-407E-A947-70E740481C1C}">
                           <a14:useLocalDpi xmlns:a14="http://schemas.microsoft.com/office/drawing/2010/main" val="0"/>
@@ -398,7 +398,7 @@
           <w:r>
             <w:fldChar w:fldCharType="separate"/>
           </w:r>
-          <w:hyperlink w:anchor="_Toc229954869" w:history="1">
+          <w:hyperlink w:anchor="_Toc230018347" w:history="1">
             <w:r>
               <w:rPr>
                 <w:rStyle w:val="Hyperlink"/>
@@ -442,7 +442,7 @@
                 <w:noProof/>
                 <w:webHidden/>
               </w:rPr>
-              <w:instrText xml:space="preserve"> PAGEREF _Toc229954869 \h </w:instrText>
+              <w:instrText xml:space="preserve"> PAGEREF _Toc230018347 \h </w:instrText>
             </w:r>
             <w:r>
               <w:rPr>
@@ -488,7 +488,7 @@
               <w:lang w:val="en-US"/>
             </w:rPr>
           </w:pPr>
-          <w:hyperlink w:anchor="_Toc229954870" w:history="1">
+          <w:hyperlink w:anchor="_Toc230018348" w:history="1">
             <w:r>
               <w:rPr>
                 <w:rStyle w:val="Hyperlink"/>
@@ -532,7 +532,7 @@
                 <w:noProof/>
                 <w:webHidden/>
               </w:rPr>
-              <w:instrText xml:space="preserve"> PAGEREF _Toc229954870 \h </w:instrText>
+              <w:instrText xml:space="preserve"> PAGEREF _Toc230018348 \h </w:instrText>
             </w:r>
             <w:r>
               <w:rPr>
@@ -570,10 +570,14 @@
               <w:tab w:val="right" w:leader="dot" w:pos="9350"/>
             </w:tabs>
             <w:rPr>
+              <w:rFonts w:eastAsiaTheme="minorEastAsia"/>
               <w:noProof/>
+              <w:sz w:val="24"/>
+              <w:szCs w:val="24"/>
+              <w:lang w:val="en-US"/>
             </w:rPr>
           </w:pPr>
-          <w:hyperlink w:anchor="_Toc229954871" w:history="1">
+          <w:hyperlink w:anchor="_Toc230018349" w:history="1">
             <w:r>
               <w:rPr>
                 <w:rStyle w:val="Hyperlink"/>
@@ -600,7 +604,7 @@
                 <w:noProof/>
                 <w:webHidden/>
               </w:rPr>
-              <w:instrText xml:space="preserve"> PAGEREF _Toc229954871 \h </w:instrText>
+              <w:instrText xml:space="preserve"> PAGEREF _Toc230018349 \h </w:instrText>
             </w:r>
             <w:r>
               <w:rPr>
@@ -638,10 +642,14 @@
               <w:tab w:val="right" w:leader="dot" w:pos="9350"/>
             </w:tabs>
             <w:rPr>
+              <w:rFonts w:eastAsiaTheme="minorEastAsia"/>
               <w:noProof/>
+              <w:sz w:val="24"/>
+              <w:szCs w:val="24"/>
+              <w:lang w:val="en-US"/>
             </w:rPr>
           </w:pPr>
-          <w:hyperlink w:anchor="_Toc229954872" w:history="1">
+          <w:hyperlink w:anchor="_Toc230018350" w:history="1">
             <w:r>
               <w:rPr>
                 <w:rStyle w:val="Hyperlink"/>
@@ -668,7 +676,7 @@
                 <w:noProof/>
                 <w:webHidden/>
               </w:rPr>
-              <w:instrText xml:space="preserve"> PAGEREF _Toc229954872 \h </w:instrText>
+              <w:instrText xml:space="preserve"> PAGEREF _Toc230018350 \h </w:instrText>
             </w:r>
             <w:r>
               <w:rPr>
@@ -714,7 +722,7 @@
               <w:lang w:val="en-US"/>
             </w:rPr>
           </w:pPr>
-          <w:hyperlink w:anchor="_Toc229954873" w:history="1">
+          <w:hyperlink w:anchor="_Toc230018351" w:history="1">
             <w:r>
               <w:rPr>
                 <w:rStyle w:val="Hyperlink"/>
@@ -758,7 +766,7 @@
                 <w:noProof/>
                 <w:webHidden/>
               </w:rPr>
-              <w:instrText xml:space="preserve"> PAGEREF _Toc229954873 \h </w:instrText>
+              <w:instrText xml:space="preserve"> PAGEREF _Toc230018351 \h </w:instrText>
             </w:r>
             <w:r>
               <w:rPr>
@@ -797,10 +805,14 @@
               <w:tab w:val="right" w:leader="dot" w:pos="9350"/>
             </w:tabs>
             <w:rPr>
+              <w:rFonts w:eastAsiaTheme="minorEastAsia"/>
               <w:noProof/>
+              <w:sz w:val="24"/>
+              <w:szCs w:val="24"/>
+              <w:lang w:val="en-US"/>
             </w:rPr>
           </w:pPr>
-          <w:hyperlink w:anchor="_Toc229954874" w:history="1">
+          <w:hyperlink w:anchor="_Toc230018352" w:history="1">
             <w:r>
               <w:rPr>
                 <w:rStyle w:val="Hyperlink"/>
@@ -810,7 +822,11 @@
             </w:r>
             <w:r>
               <w:rPr>
-                <w:noProof/>
+                <w:rFonts w:eastAsiaTheme="minorEastAsia"/>
+                <w:noProof/>
+                <w:sz w:val="24"/>
+                <w:szCs w:val="24"/>
+                <w:lang w:val="en-US"/>
               </w:rPr>
               <w:tab/>
             </w:r>
@@ -840,7 +856,7 @@
                 <w:noProof/>
                 <w:webHidden/>
               </w:rPr>
-              <w:instrText xml:space="preserve"> PAGEREF _Toc229954874 \h </w:instrText>
+              <w:instrText xml:space="preserve"> PAGEREF _Toc230018352 \h </w:instrText>
             </w:r>
             <w:r>
               <w:rPr>
@@ -879,10 +895,14 @@
               <w:tab w:val="right" w:leader="dot" w:pos="9350"/>
             </w:tabs>
             <w:rPr>
+              <w:rFonts w:eastAsiaTheme="minorEastAsia"/>
               <w:noProof/>
+              <w:sz w:val="24"/>
+              <w:szCs w:val="24"/>
+              <w:lang w:val="en-US"/>
             </w:rPr>
           </w:pPr>
-          <w:hyperlink w:anchor="_Toc229954875" w:history="1">
+          <w:hyperlink w:anchor="_Toc230018353" w:history="1">
             <w:r>
               <w:rPr>
                 <w:rStyle w:val="Hyperlink"/>
@@ -892,7 +912,11 @@
             </w:r>
             <w:r>
               <w:rPr>
-                <w:noProof/>
+                <w:rFonts w:eastAsiaTheme="minorEastAsia"/>
+                <w:noProof/>
+                <w:sz w:val="24"/>
+                <w:szCs w:val="24"/>
+                <w:lang w:val="en-US"/>
               </w:rPr>
               <w:tab/>
             </w:r>
@@ -922,7 +946,7 @@
                 <w:noProof/>
                 <w:webHidden/>
               </w:rPr>
-              <w:instrText xml:space="preserve"> PAGEREF _Toc229954875 \h </w:instrText>
+              <w:instrText xml:space="preserve"> PAGEREF _Toc230018353 \h </w:instrText>
             </w:r>
             <w:r>
               <w:rPr>
@@ -961,10 +985,14 @@
               <w:tab w:val="right" w:leader="dot" w:pos="9350"/>
             </w:tabs>
             <w:rPr>
+              <w:rFonts w:eastAsiaTheme="minorEastAsia"/>
               <w:noProof/>
+              <w:sz w:val="24"/>
+              <w:szCs w:val="24"/>
+              <w:lang w:val="en-US"/>
             </w:rPr>
           </w:pPr>
-          <w:hyperlink w:anchor="_Toc229954876" w:history="1">
+          <w:hyperlink w:anchor="_Toc230018354" w:history="1">
             <w:r>
               <w:rPr>
                 <w:rStyle w:val="Hyperlink"/>
@@ -974,7 +1002,11 @@
             </w:r>
             <w:r>
               <w:rPr>
-                <w:noProof/>
+                <w:rFonts w:eastAsiaTheme="minorEastAsia"/>
+                <w:noProof/>
+                <w:sz w:val="24"/>
+                <w:szCs w:val="24"/>
+                <w:lang w:val="en-US"/>
               </w:rPr>
               <w:tab/>
             </w:r>
@@ -1004,7 +1036,7 @@
                 <w:noProof/>
                 <w:webHidden/>
               </w:rPr>
-              <w:instrText xml:space="preserve"> PAGEREF _Toc229954876 \h </w:instrText>
+              <w:instrText xml:space="preserve"> PAGEREF _Toc230018354 \h </w:instrText>
             </w:r>
             <w:r>
               <w:rPr>
@@ -1043,10 +1075,14 @@
               <w:tab w:val="right" w:leader="dot" w:pos="9350"/>
             </w:tabs>
             <w:rPr>
+              <w:rFonts w:eastAsiaTheme="minorEastAsia"/>
               <w:noProof/>
+              <w:sz w:val="24"/>
+              <w:szCs w:val="24"/>
+              <w:lang w:val="en-US"/>
             </w:rPr>
           </w:pPr>
-          <w:hyperlink w:anchor="_Toc229954877" w:history="1">
+          <w:hyperlink w:anchor="_Toc230018355" w:history="1">
             <w:r>
               <w:rPr>
                 <w:rStyle w:val="Hyperlink"/>
@@ -1056,7 +1092,11 @@
             </w:r>
             <w:r>
               <w:rPr>
-                <w:noProof/>
+                <w:rFonts w:eastAsiaTheme="minorEastAsia"/>
+                <w:noProof/>
+                <w:sz w:val="24"/>
+                <w:szCs w:val="24"/>
+                <w:lang w:val="en-US"/>
               </w:rPr>
               <w:tab/>
             </w:r>
@@ -1086,7 +1126,7 @@
                 <w:noProof/>
                 <w:webHidden/>
               </w:rPr>
-              <w:instrText xml:space="preserve"> PAGEREF _Toc229954877 \h </w:instrText>
+              <w:instrText xml:space="preserve"> PAGEREF _Toc230018355 \h </w:instrText>
             </w:r>
             <w:r>
               <w:rPr>
@@ -1125,10 +1165,14 @@
               <w:tab w:val="right" w:leader="dot" w:pos="9350"/>
             </w:tabs>
             <w:rPr>
+              <w:rFonts w:eastAsiaTheme="minorEastAsia"/>
               <w:noProof/>
+              <w:sz w:val="24"/>
+              <w:szCs w:val="24"/>
+              <w:lang w:val="en-US"/>
             </w:rPr>
           </w:pPr>
-          <w:hyperlink w:anchor="_Toc229954878" w:history="1">
+          <w:hyperlink w:anchor="_Toc230018356" w:history="1">
             <w:r>
               <w:rPr>
                 <w:rStyle w:val="Hyperlink"/>
@@ -1138,7 +1182,11 @@
             </w:r>
             <w:r>
               <w:rPr>
-                <w:noProof/>
+                <w:rFonts w:eastAsiaTheme="minorEastAsia"/>
+                <w:noProof/>
+                <w:sz w:val="24"/>
+                <w:szCs w:val="24"/>
+                <w:lang w:val="en-US"/>
               </w:rPr>
               <w:tab/>
             </w:r>
@@ -1168,7 +1216,7 @@
                 <w:noProof/>
                 <w:webHidden/>
               </w:rPr>
-              <w:instrText xml:space="preserve"> PAGEREF _Toc229954878 \h </w:instrText>
+              <w:instrText xml:space="preserve"> PAGEREF _Toc230018356 \h </w:instrText>
             </w:r>
             <w:r>
               <w:rPr>
@@ -1207,10 +1255,14 @@
               <w:tab w:val="right" w:leader="dot" w:pos="9350"/>
             </w:tabs>
             <w:rPr>
+              <w:rFonts w:eastAsiaTheme="minorEastAsia"/>
               <w:noProof/>
+              <w:sz w:val="24"/>
+              <w:szCs w:val="24"/>
+              <w:lang w:val="en-US"/>
             </w:rPr>
           </w:pPr>
-          <w:hyperlink w:anchor="_Toc229954879" w:history="1">
+          <w:hyperlink w:anchor="_Toc230018357" w:history="1">
             <w:r>
               <w:rPr>
                 <w:rStyle w:val="Hyperlink"/>
@@ -1220,7 +1272,11 @@
             </w:r>
             <w:r>
               <w:rPr>
-                <w:noProof/>
+                <w:rFonts w:eastAsiaTheme="minorEastAsia"/>
+                <w:noProof/>
+                <w:sz w:val="24"/>
+                <w:szCs w:val="24"/>
+                <w:lang w:val="en-US"/>
               </w:rPr>
               <w:tab/>
             </w:r>
@@ -1250,7 +1306,7 @@
                 <w:noProof/>
                 <w:webHidden/>
               </w:rPr>
-              <w:instrText xml:space="preserve"> PAGEREF _Toc229954879 \h </w:instrText>
+              <w:instrText xml:space="preserve"> PAGEREF _Toc230018357 \h </w:instrText>
             </w:r>
             <w:r>
               <w:rPr>
@@ -1296,7 +1352,7 @@
               <w:lang w:val="en-US"/>
             </w:rPr>
           </w:pPr>
-          <w:hyperlink w:anchor="_Toc229954880" w:history="1">
+          <w:hyperlink w:anchor="_Toc230018358" w:history="1">
             <w:r>
               <w:rPr>
                 <w:rStyle w:val="Hyperlink"/>
@@ -1340,7 +1396,7 @@
                 <w:noProof/>
                 <w:webHidden/>
               </w:rPr>
-              <w:instrText xml:space="preserve"> PAGEREF _Toc229954880 \h </w:instrText>
+              <w:instrText xml:space="preserve"> PAGEREF _Toc230018358 \h </w:instrText>
             </w:r>
             <w:r>
               <w:rPr>
@@ -1386,7 +1442,7 @@
               <w:lang w:val="en-US"/>
             </w:rPr>
           </w:pPr>
-          <w:hyperlink w:anchor="_Toc229954881" w:history="1">
+          <w:hyperlink w:anchor="_Toc230018359" w:history="1">
             <w:r>
               <w:rPr>
                 <w:rStyle w:val="Hyperlink"/>
@@ -1430,7 +1486,7 @@
                 <w:noProof/>
                 <w:webHidden/>
               </w:rPr>
-              <w:instrText xml:space="preserve"> PAGEREF _Toc229954881 \h </w:instrText>
+              <w:instrText xml:space="preserve"> PAGEREF _Toc230018359 \h </w:instrText>
             </w:r>
             <w:r>
               <w:rPr>
@@ -1469,10 +1525,14 @@
               <w:tab w:val="right" w:leader="dot" w:pos="9350"/>
             </w:tabs>
             <w:rPr>
+              <w:rFonts w:eastAsiaTheme="minorEastAsia"/>
               <w:noProof/>
+              <w:sz w:val="24"/>
+              <w:szCs w:val="24"/>
+              <w:lang w:val="en-US"/>
             </w:rPr>
           </w:pPr>
-          <w:hyperlink w:anchor="_Toc229954882" w:history="1">
+          <w:hyperlink w:anchor="_Toc230018360" w:history="1">
             <w:r>
               <w:rPr>
                 <w:rStyle w:val="Hyperlink"/>
@@ -1482,7 +1542,11 @@
             </w:r>
             <w:r>
               <w:rPr>
-                <w:noProof/>
+                <w:rFonts w:eastAsiaTheme="minorEastAsia"/>
+                <w:noProof/>
+                <w:sz w:val="24"/>
+                <w:szCs w:val="24"/>
+                <w:lang w:val="en-US"/>
               </w:rPr>
               <w:tab/>
             </w:r>
@@ -1512,7 +1576,79 @@
                 <w:noProof/>
                 <w:webHidden/>
               </w:rPr>
-              <w:instrText xml:space="preserve"> PAGEREF _Toc229954882 \h </w:instrText>
+              <w:instrText xml:space="preserve"> PAGEREF _Toc230018360 \h </w:instrText>
+            </w:r>
+            <w:r>
+              <w:rPr>
+                <w:noProof/>
+                <w:webHidden/>
+              </w:rPr>
+            </w:r>
+            <w:r>
+              <w:rPr>
+                <w:noProof/>
+                <w:webHidden/>
+              </w:rPr>
+              <w:fldChar w:fldCharType="separate"/>
+            </w:r>
+            <w:r>
+              <w:rPr>
+                <w:noProof/>
+                <w:webHidden/>
+              </w:rPr>
+              <w:t>12</w:t>
+            </w:r>
+            <w:r>
+              <w:rPr>
+                <w:noProof/>
+                <w:webHidden/>
+              </w:rPr>
+              <w:fldChar w:fldCharType="end"/>
+            </w:r>
+          </w:hyperlink>
+        </w:p>
+        <w:p>
+          <w:pPr>
+            <w:pStyle w:val="TOC2"/>
+            <w:tabs>
+              <w:tab w:val="right" w:leader="dot" w:pos="9350"/>
+            </w:tabs>
+            <w:rPr>
+              <w:rFonts w:eastAsiaTheme="minorEastAsia"/>
+              <w:noProof/>
+              <w:sz w:val="24"/>
+              <w:szCs w:val="24"/>
+              <w:lang w:val="en-US"/>
+            </w:rPr>
+          </w:pPr>
+          <w:hyperlink w:anchor="_Toc230018361" w:history="1">
+            <w:r>
+              <w:rPr>
+                <w:rStyle w:val="Hyperlink"/>
+                <w:noProof/>
+              </w:rPr>
+              <w:t>Fault tests</w:t>
+            </w:r>
+            <w:r>
+              <w:rPr>
+                <w:noProof/>
+                <w:webHidden/>
+              </w:rPr>
+              <w:tab/>
+            </w:r>
+            <w:r>
+              <w:rPr>
+                <w:noProof/>
+                <w:webHidden/>
+              </w:rPr>
+              <w:fldChar w:fldCharType="begin"/>
+            </w:r>
+            <w:r>
+              <w:rPr>
+                <w:noProof/>
+                <w:webHidden/>
+              </w:rPr>
+              <w:instrText xml:space="preserve"> PAGEREF _Toc230018361 \h </w:instrText>
             </w:r>
             <w:r>
               <w:rPr>
@@ -1551,10 +1687,14 @@
               <w:tab w:val="right" w:leader="dot" w:pos="9350"/>
             </w:tabs>
             <w:rPr>
+              <w:rFonts w:eastAsiaTheme="minorEastAsia"/>
               <w:noProof/>
+              <w:sz w:val="24"/>
+              <w:szCs w:val="24"/>
+              <w:lang w:val="en-US"/>
             </w:rPr>
           </w:pPr>
-          <w:hyperlink w:anchor="_Toc229954883" w:history="1">
+          <w:hyperlink w:anchor="_Toc230018362" w:history="1">
             <w:r>
               <w:rPr>
                 <w:rStyle w:val="Hyperlink"/>
@@ -1564,7 +1704,11 @@
             </w:r>
             <w:r>
               <w:rPr>
-                <w:noProof/>
+                <w:rFonts w:eastAsiaTheme="minorEastAsia"/>
+                <w:noProof/>
+                <w:sz w:val="24"/>
+                <w:szCs w:val="24"/>
+                <w:lang w:val="en-US"/>
               </w:rPr>
               <w:tab/>
             </w:r>
@@ -1573,7 +1717,7 @@
                 <w:rStyle w:val="Hyperlink"/>
                 <w:noProof/>
               </w:rPr>
-              <w:t>Fault tests</w:t>
+              <w:t>Testing approach</w:t>
             </w:r>
             <w:r>
               <w:rPr>
@@ -1594,7 +1738,7 @@
                 <w:noProof/>
                 <w:webHidden/>
               </w:rPr>
-              <w:instrText xml:space="preserve"> PAGEREF _Toc229954883 \h </w:instrText>
+              <w:instrText xml:space="preserve"> PAGEREF _Toc230018362 \h </w:instrText>
             </w:r>
             <w:r>
               <w:rPr>
@@ -1633,10 +1777,14 @@
               <w:tab w:val="right" w:leader="dot" w:pos="9350"/>
             </w:tabs>
             <w:rPr>
+              <w:rFonts w:eastAsiaTheme="minorEastAsia"/>
               <w:noProof/>
+              <w:sz w:val="24"/>
+              <w:szCs w:val="24"/>
+              <w:lang w:val="en-US"/>
             </w:rPr>
           </w:pPr>
-          <w:hyperlink w:anchor="_Toc229954884" w:history="1">
+          <w:hyperlink w:anchor="_Toc230018363" w:history="1">
             <w:r>
               <w:rPr>
                 <w:rStyle w:val="Hyperlink"/>
@@ -1646,7 +1794,11 @@
             </w:r>
             <w:r>
               <w:rPr>
-                <w:noProof/>
+                <w:rFonts w:eastAsiaTheme="minorEastAsia"/>
+                <w:noProof/>
+                <w:sz w:val="24"/>
+                <w:szCs w:val="24"/>
+                <w:lang w:val="en-US"/>
               </w:rPr>
               <w:tab/>
             </w:r>
@@ -1655,7 +1807,7 @@
                 <w:rStyle w:val="Hyperlink"/>
                 <w:noProof/>
               </w:rPr>
-              <w:t>Testing approach</w:t>
+              <w:t>Client disconnect – sequence diagram</w:t>
             </w:r>
             <w:r>
               <w:rPr>
@@ -1676,7 +1828,7 @@
                 <w:noProof/>
                 <w:webHidden/>
               </w:rPr>
-              <w:instrText xml:space="preserve"> PAGEREF _Toc229954884 \h </w:instrText>
+              <w:instrText xml:space="preserve"> PAGEREF _Toc230018363 \h </w:instrText>
             </w:r>
             <w:r>
               <w:rPr>
@@ -1696,7 +1848,7 @@
                 <w:noProof/>
                 <w:webHidden/>
               </w:rPr>
-              <w:t>12</w:t>
+              <w:t>13</w:t>
             </w:r>
             <w:r>
               <w:rPr>
@@ -1715,10 +1867,14 @@
               <w:tab w:val="right" w:leader="dot" w:pos="9350"/>
             </w:tabs>
             <w:rPr>
+              <w:rFonts w:eastAsiaTheme="minorEastAsia"/>
               <w:noProof/>
+              <w:sz w:val="24"/>
+              <w:szCs w:val="24"/>
+              <w:lang w:val="en-US"/>
             </w:rPr>
           </w:pPr>
-          <w:hyperlink w:anchor="_Toc229954885" w:history="1">
+          <w:hyperlink w:anchor="_Toc230018364" w:history="1">
             <w:r>
               <w:rPr>
                 <w:rStyle w:val="Hyperlink"/>
@@ -1728,7 +1884,11 @@
             </w:r>
             <w:r>
               <w:rPr>
-                <w:noProof/>
+                <w:rFonts w:eastAsiaTheme="minorEastAsia"/>
+                <w:noProof/>
+                <w:sz w:val="24"/>
+                <w:szCs w:val="24"/>
+                <w:lang w:val="en-US"/>
               </w:rPr>
               <w:tab/>
             </w:r>
@@ -1737,7 +1897,7 @@
                 <w:rStyle w:val="Hyperlink"/>
                 <w:noProof/>
               </w:rPr>
-              <w:t>Client disconnect – sequence diagram</w:t>
+              <w:t>Communication delay – sequence diagram</w:t>
             </w:r>
             <w:r>
               <w:rPr>
@@ -1758,89 +1918,7 @@
                 <w:noProof/>
                 <w:webHidden/>
               </w:rPr>
-              <w:instrText xml:space="preserve"> PAGEREF _Toc229954885 \h </w:instrText>
-            </w:r>
-            <w:r>
-              <w:rPr>
-                <w:noProof/>
-                <w:webHidden/>
-              </w:rPr>
-            </w:r>
-            <w:r>
-              <w:rPr>
-                <w:noProof/>
-                <w:webHidden/>
-              </w:rPr>
-              <w:fldChar w:fldCharType="separate"/>
-            </w:r>
-            <w:r>
-              <w:rPr>
-                <w:noProof/>
-                <w:webHidden/>
-              </w:rPr>
-              <w:t>13</w:t>
-            </w:r>
-            <w:r>
-              <w:rPr>
-                <w:noProof/>
-                <w:webHidden/>
-              </w:rPr>
-              <w:fldChar w:fldCharType="end"/>
-            </w:r>
-          </w:hyperlink>
-        </w:p>
-        <w:p>
-          <w:pPr>
-            <w:pStyle w:val="TOC2"/>
-            <w:tabs>
-              <w:tab w:val="left" w:pos="960"/>
-              <w:tab w:val="right" w:leader="dot" w:pos="9350"/>
-            </w:tabs>
-            <w:rPr>
-              <w:noProof/>
-            </w:rPr>
-          </w:pPr>
-          <w:hyperlink w:anchor="_Toc229954886" w:history="1">
-            <w:r>
-              <w:rPr>
-                <w:rStyle w:val="Hyperlink"/>
-                <w:noProof/>
-              </w:rPr>
-              <w:t>5.5</w:t>
-            </w:r>
-            <w:r>
-              <w:rPr>
-                <w:noProof/>
-              </w:rPr>
-              <w:tab/>
-            </w:r>
-            <w:r>
-              <w:rPr>
-                <w:rStyle w:val="Hyperlink"/>
-                <w:noProof/>
-              </w:rPr>
-              <w:t>Communication delay – sequence diagram</w:t>
-            </w:r>
-            <w:r>
-              <w:rPr>
-                <w:noProof/>
-                <w:webHidden/>
-              </w:rPr>
-              <w:tab/>
-            </w:r>
-            <w:r>
-              <w:rPr>
-                <w:noProof/>
-                <w:webHidden/>
-              </w:rPr>
-              <w:fldChar w:fldCharType="begin"/>
-            </w:r>
-            <w:r>
-              <w:rPr>
-                <w:noProof/>
-                <w:webHidden/>
-              </w:rPr>
-              <w:instrText xml:space="preserve"> PAGEREF _Toc229954886 \h </w:instrText>
+              <w:instrText xml:space="preserve"> PAGEREF _Toc230018364 \h </w:instrText>
             </w:r>
             <w:r>
               <w:rPr>
@@ -1886,7 +1964,7 @@
               <w:lang w:val="en-US"/>
             </w:rPr>
           </w:pPr>
-          <w:hyperlink w:anchor="_Toc229954887" w:history="1">
+          <w:hyperlink w:anchor="_Toc230018365" w:history="1">
             <w:r>
               <w:rPr>
                 <w:rStyle w:val="Hyperlink"/>
@@ -1930,7 +2008,7 @@
                 <w:noProof/>
                 <w:webHidden/>
               </w:rPr>
-              <w:instrText xml:space="preserve"> PAGEREF _Toc229954887 \h </w:instrText>
+              <w:instrText xml:space="preserve"> PAGEREF _Toc230018365 \h </w:instrText>
             </w:r>
             <w:r>
               <w:rPr>
@@ -1951,6 +2029,650 @@
                 <w:webHidden/>
               </w:rPr>
               <w:t>15</w:t>
+            </w:r>
+            <w:r>
+              <w:rPr>
+                <w:noProof/>
+                <w:webHidden/>
+              </w:rPr>
+              <w:fldChar w:fldCharType="end"/>
+            </w:r>
+          </w:hyperlink>
+        </w:p>
+        <w:p>
+          <w:pPr>
+            <w:pStyle w:val="TOC2"/>
+            <w:tabs>
+              <w:tab w:val="left" w:pos="1200"/>
+              <w:tab w:val="right" w:leader="dot" w:pos="9350"/>
+            </w:tabs>
+            <w:rPr>
+              <w:rFonts w:eastAsiaTheme="minorEastAsia"/>
+              <w:noProof/>
+              <w:sz w:val="24"/>
+              <w:szCs w:val="24"/>
+              <w:lang w:val="en-US"/>
+            </w:rPr>
+          </w:pPr>
+          <w:hyperlink w:anchor="_Toc230018366" w:history="1">
+            <w:r>
+              <w:rPr>
+                <w:rStyle w:val="Hyperlink"/>
+                <w:noProof/>
+              </w:rPr>
+              <w:t>6.1 T1</w:t>
+            </w:r>
+            <w:r>
+              <w:rPr>
+                <w:rFonts w:eastAsiaTheme="minorEastAsia"/>
+                <w:noProof/>
+                <w:sz w:val="24"/>
+                <w:szCs w:val="24"/>
+                <w:lang w:val="en-US"/>
+              </w:rPr>
+              <w:tab/>
+            </w:r>
+            <w:r>
+              <w:rPr>
+                <w:rStyle w:val="Hyperlink"/>
+                <w:noProof/>
+              </w:rPr>
+              <w:t>- Multi</w:t>
+            </w:r>
+            <w:r>
+              <w:rPr>
+                <w:rStyle w:val="Hyperlink"/>
+                <w:noProof/>
+              </w:rPr>
+              <w:t>p</w:t>
+            </w:r>
+            <w:r>
+              <w:rPr>
+                <w:rStyle w:val="Hyperlink"/>
+                <w:noProof/>
+              </w:rPr>
+              <w:t>le client connection</w:t>
+            </w:r>
+            <w:r>
+              <w:rPr>
+                <w:noProof/>
+                <w:webHidden/>
+              </w:rPr>
+              <w:tab/>
+            </w:r>
+            <w:r>
+              <w:rPr>
+                <w:noProof/>
+                <w:webHidden/>
+              </w:rPr>
+              <w:fldChar w:fldCharType="begin"/>
+            </w:r>
+            <w:r>
+              <w:rPr>
+                <w:noProof/>
+                <w:webHidden/>
+              </w:rPr>
+              <w:instrText xml:space="preserve"> PAGEREF _Toc230018366 \h </w:instrText>
+            </w:r>
+            <w:r>
+              <w:rPr>
+                <w:noProof/>
+                <w:webHidden/>
+              </w:rPr>
+            </w:r>
+            <w:r>
+              <w:rPr>
+                <w:noProof/>
+                <w:webHidden/>
+              </w:rPr>
+              <w:fldChar w:fldCharType="separate"/>
+            </w:r>
+            <w:r>
+              <w:rPr>
+                <w:noProof/>
+                <w:webHidden/>
+              </w:rPr>
+              <w:t>15</w:t>
+            </w:r>
+            <w:r>
+              <w:rPr>
+                <w:noProof/>
+                <w:webHidden/>
+              </w:rPr>
+              <w:fldChar w:fldCharType="end"/>
+            </w:r>
+          </w:hyperlink>
+        </w:p>
+        <w:p>
+          <w:pPr>
+            <w:pStyle w:val="TOC2"/>
+            <w:tabs>
+              <w:tab w:val="left" w:pos="1200"/>
+              <w:tab w:val="right" w:leader="dot" w:pos="9350"/>
+            </w:tabs>
+            <w:rPr>
+              <w:rFonts w:eastAsiaTheme="minorEastAsia"/>
+              <w:noProof/>
+              <w:sz w:val="24"/>
+              <w:szCs w:val="24"/>
+              <w:lang w:val="en-US"/>
+            </w:rPr>
+          </w:pPr>
+          <w:hyperlink w:anchor="_Toc230018367" w:history="1">
+            <w:r>
+              <w:rPr>
+                <w:rStyle w:val="Hyperlink"/>
+                <w:noProof/>
+              </w:rPr>
+              <w:t>6.2 T2</w:t>
+            </w:r>
+            <w:r>
+              <w:rPr>
+                <w:rFonts w:eastAsiaTheme="minorEastAsia"/>
+                <w:noProof/>
+                <w:sz w:val="24"/>
+                <w:szCs w:val="24"/>
+                <w:lang w:val="en-US"/>
+              </w:rPr>
+              <w:tab/>
+            </w:r>
+            <w:r>
+              <w:rPr>
+                <w:rStyle w:val="Hyperlink"/>
+                <w:noProof/>
+              </w:rPr>
+              <w:t>- Concurrent movement</w:t>
+            </w:r>
+            <w:r>
+              <w:rPr>
+                <w:noProof/>
+                <w:webHidden/>
+              </w:rPr>
+              <w:tab/>
+            </w:r>
+            <w:r>
+              <w:rPr>
+                <w:noProof/>
+                <w:webHidden/>
+              </w:rPr>
+              <w:fldChar w:fldCharType="begin"/>
+            </w:r>
+            <w:r>
+              <w:rPr>
+                <w:noProof/>
+                <w:webHidden/>
+              </w:rPr>
+              <w:instrText xml:space="preserve"> PAGEREF _Toc230018367 \h </w:instrText>
+            </w:r>
+            <w:r>
+              <w:rPr>
+                <w:noProof/>
+                <w:webHidden/>
+              </w:rPr>
+            </w:r>
+            <w:r>
+              <w:rPr>
+                <w:noProof/>
+                <w:webHidden/>
+              </w:rPr>
+              <w:fldChar w:fldCharType="separate"/>
+            </w:r>
+            <w:r>
+              <w:rPr>
+                <w:noProof/>
+                <w:webHidden/>
+              </w:rPr>
+              <w:t>15</w:t>
+            </w:r>
+            <w:r>
+              <w:rPr>
+                <w:noProof/>
+                <w:webHidden/>
+              </w:rPr>
+              <w:fldChar w:fldCharType="end"/>
+            </w:r>
+          </w:hyperlink>
+        </w:p>
+        <w:p>
+          <w:pPr>
+            <w:pStyle w:val="TOC2"/>
+            <w:tabs>
+              <w:tab w:val="left" w:pos="1200"/>
+              <w:tab w:val="right" w:leader="dot" w:pos="9350"/>
+            </w:tabs>
+            <w:rPr>
+              <w:rFonts w:eastAsiaTheme="minorEastAsia"/>
+              <w:noProof/>
+              <w:sz w:val="24"/>
+              <w:szCs w:val="24"/>
+              <w:lang w:val="en-US"/>
+            </w:rPr>
+          </w:pPr>
+          <w:hyperlink w:anchor="_Toc230018368" w:history="1">
+            <w:r>
+              <w:rPr>
+                <w:rStyle w:val="Hyperlink"/>
+                <w:noProof/>
+              </w:rPr>
+              <w:t>6.3 T3</w:t>
+            </w:r>
+            <w:r>
+              <w:rPr>
+                <w:rFonts w:eastAsiaTheme="minorEastAsia"/>
+                <w:noProof/>
+                <w:sz w:val="24"/>
+                <w:szCs w:val="24"/>
+                <w:lang w:val="en-US"/>
+              </w:rPr>
+              <w:tab/>
+            </w:r>
+            <w:r>
+              <w:rPr>
+                <w:rStyle w:val="Hyperlink"/>
+                <w:noProof/>
+              </w:rPr>
+              <w:t>- Client disconnection</w:t>
+            </w:r>
+            <w:r>
+              <w:rPr>
+                <w:noProof/>
+                <w:webHidden/>
+              </w:rPr>
+              <w:tab/>
+            </w:r>
+            <w:r>
+              <w:rPr>
+                <w:noProof/>
+                <w:webHidden/>
+              </w:rPr>
+              <w:fldChar w:fldCharType="begin"/>
+            </w:r>
+            <w:r>
+              <w:rPr>
+                <w:noProof/>
+                <w:webHidden/>
+              </w:rPr>
+              <w:instrText xml:space="preserve"> PAGEREF _Toc230018368 \h </w:instrText>
+            </w:r>
+            <w:r>
+              <w:rPr>
+                <w:noProof/>
+                <w:webHidden/>
+              </w:rPr>
+            </w:r>
+            <w:r>
+              <w:rPr>
+                <w:noProof/>
+                <w:webHidden/>
+              </w:rPr>
+              <w:fldChar w:fldCharType="separate"/>
+            </w:r>
+            <w:r>
+              <w:rPr>
+                <w:noProof/>
+                <w:webHidden/>
+              </w:rPr>
+              <w:t>16</w:t>
+            </w:r>
+            <w:r>
+              <w:rPr>
+                <w:noProof/>
+                <w:webHidden/>
+              </w:rPr>
+              <w:fldChar w:fldCharType="end"/>
+            </w:r>
+          </w:hyperlink>
+        </w:p>
+        <w:p>
+          <w:pPr>
+            <w:pStyle w:val="TOC2"/>
+            <w:tabs>
+              <w:tab w:val="left" w:pos="1200"/>
+              <w:tab w:val="right" w:leader="dot" w:pos="9350"/>
+            </w:tabs>
+            <w:rPr>
+              <w:rFonts w:eastAsiaTheme="minorEastAsia"/>
+              <w:noProof/>
+              <w:sz w:val="24"/>
+              <w:szCs w:val="24"/>
+              <w:lang w:val="en-US"/>
+            </w:rPr>
+          </w:pPr>
+          <w:hyperlink w:anchor="_Toc230018369" w:history="1">
+            <w:r>
+              <w:rPr>
+                <w:rStyle w:val="Hyperlink"/>
+                <w:noProof/>
+              </w:rPr>
+              <w:t>6.4 T4</w:t>
+            </w:r>
+            <w:r>
+              <w:rPr>
+                <w:rFonts w:eastAsiaTheme="minorEastAsia"/>
+                <w:noProof/>
+                <w:sz w:val="24"/>
+                <w:szCs w:val="24"/>
+                <w:lang w:val="en-US"/>
+              </w:rPr>
+              <w:tab/>
+            </w:r>
+            <w:r>
+              <w:rPr>
+                <w:rStyle w:val="Hyperlink"/>
+                <w:noProof/>
+              </w:rPr>
+              <w:t>- High number of participants</w:t>
+            </w:r>
+            <w:r>
+              <w:rPr>
+                <w:noProof/>
+                <w:webHidden/>
+              </w:rPr>
+              <w:tab/>
+            </w:r>
+            <w:r>
+              <w:rPr>
+                <w:noProof/>
+                <w:webHidden/>
+              </w:rPr>
+              <w:fldChar w:fldCharType="begin"/>
+            </w:r>
+            <w:r>
+              <w:rPr>
+                <w:noProof/>
+                <w:webHidden/>
+              </w:rPr>
+              <w:instrText xml:space="preserve"> PAGEREF _Toc230018369 \h </w:instrText>
+            </w:r>
+            <w:r>
+              <w:rPr>
+                <w:noProof/>
+                <w:webHidden/>
+              </w:rPr>
+            </w:r>
+            <w:r>
+              <w:rPr>
+                <w:noProof/>
+                <w:webHidden/>
+              </w:rPr>
+              <w:fldChar w:fldCharType="separate"/>
+            </w:r>
+            <w:r>
+              <w:rPr>
+                <w:noProof/>
+                <w:webHidden/>
+              </w:rPr>
+              <w:t>16</w:t>
+            </w:r>
+            <w:r>
+              <w:rPr>
+                <w:noProof/>
+                <w:webHidden/>
+              </w:rPr>
+              <w:fldChar w:fldCharType="end"/>
+            </w:r>
+          </w:hyperlink>
+        </w:p>
+        <w:p>
+          <w:pPr>
+            <w:pStyle w:val="TOC2"/>
+            <w:tabs>
+              <w:tab w:val="left" w:pos="1200"/>
+              <w:tab w:val="right" w:leader="dot" w:pos="9350"/>
+            </w:tabs>
+            <w:rPr>
+              <w:rFonts w:eastAsiaTheme="minorEastAsia"/>
+              <w:noProof/>
+              <w:sz w:val="24"/>
+              <w:szCs w:val="24"/>
+              <w:lang w:val="en-US"/>
+            </w:rPr>
+          </w:pPr>
+          <w:hyperlink w:anchor="_Toc230018370" w:history="1">
+            <w:r>
+              <w:rPr>
+                <w:rStyle w:val="Hyperlink"/>
+                <w:noProof/>
+              </w:rPr>
+              <w:t>6.5 T5</w:t>
+            </w:r>
+            <w:r>
+              <w:rPr>
+                <w:rFonts w:eastAsiaTheme="minorEastAsia"/>
+                <w:noProof/>
+                <w:sz w:val="24"/>
+                <w:szCs w:val="24"/>
+                <w:lang w:val="en-US"/>
+              </w:rPr>
+              <w:tab/>
+            </w:r>
+            <w:r>
+              <w:rPr>
+                <w:rStyle w:val="Hyperlink"/>
+                <w:noProof/>
+              </w:rPr>
+              <w:t>- Consistency validation</w:t>
+            </w:r>
+            <w:r>
+              <w:rPr>
+                <w:noProof/>
+                <w:webHidden/>
+              </w:rPr>
+              <w:tab/>
+            </w:r>
+            <w:r>
+              <w:rPr>
+                <w:noProof/>
+                <w:webHidden/>
+              </w:rPr>
+              <w:fldChar w:fldCharType="begin"/>
+            </w:r>
+            <w:r>
+              <w:rPr>
+                <w:noProof/>
+                <w:webHidden/>
+              </w:rPr>
+              <w:instrText xml:space="preserve"> PAGEREF _Toc230018370 \h </w:instrText>
+            </w:r>
+            <w:r>
+              <w:rPr>
+                <w:noProof/>
+                <w:webHidden/>
+              </w:rPr>
+            </w:r>
+            <w:r>
+              <w:rPr>
+                <w:noProof/>
+                <w:webHidden/>
+              </w:rPr>
+              <w:fldChar w:fldCharType="separate"/>
+            </w:r>
+            <w:r>
+              <w:rPr>
+                <w:noProof/>
+                <w:webHidden/>
+              </w:rPr>
+              <w:t>17</w:t>
+            </w:r>
+            <w:r>
+              <w:rPr>
+                <w:noProof/>
+                <w:webHidden/>
+              </w:rPr>
+              <w:fldChar w:fldCharType="end"/>
+            </w:r>
+          </w:hyperlink>
+        </w:p>
+        <w:p>
+          <w:pPr>
+            <w:pStyle w:val="TOC2"/>
+            <w:tabs>
+              <w:tab w:val="left" w:pos="1200"/>
+              <w:tab w:val="right" w:leader="dot" w:pos="9350"/>
+            </w:tabs>
+            <w:rPr>
+              <w:rFonts w:eastAsiaTheme="minorEastAsia"/>
+              <w:noProof/>
+              <w:sz w:val="24"/>
+              <w:szCs w:val="24"/>
+              <w:lang w:val="en-US"/>
+            </w:rPr>
+          </w:pPr>
+          <w:hyperlink w:anchor="_Toc230018371" w:history="1">
+            <w:r>
+              <w:rPr>
+                <w:rStyle w:val="Hyperlink"/>
+                <w:noProof/>
+              </w:rPr>
+              <w:t>6.6 T6</w:t>
+            </w:r>
+            <w:r>
+              <w:rPr>
+                <w:rFonts w:eastAsiaTheme="minorEastAsia"/>
+                <w:noProof/>
+                <w:sz w:val="24"/>
+                <w:szCs w:val="24"/>
+                <w:lang w:val="en-US"/>
+              </w:rPr>
+              <w:tab/>
+            </w:r>
+            <w:r>
+              <w:rPr>
+                <w:rStyle w:val="Hyperlink"/>
+                <w:noProof/>
+              </w:rPr>
+              <w:t>- Communication delay</w:t>
+            </w:r>
+            <w:r>
+              <w:rPr>
+                <w:noProof/>
+                <w:webHidden/>
+              </w:rPr>
+              <w:tab/>
+            </w:r>
+            <w:r>
+              <w:rPr>
+                <w:noProof/>
+                <w:webHidden/>
+              </w:rPr>
+              <w:fldChar w:fldCharType="begin"/>
+            </w:r>
+            <w:r>
+              <w:rPr>
+                <w:noProof/>
+                <w:webHidden/>
+              </w:rPr>
+              <w:instrText xml:space="preserve"> PAGEREF _Toc230018371 \h </w:instrText>
+            </w:r>
+            <w:r>
+              <w:rPr>
+                <w:noProof/>
+                <w:webHidden/>
+              </w:rPr>
+            </w:r>
+            <w:r>
+              <w:rPr>
+                <w:noProof/>
+                <w:webHidden/>
+              </w:rPr>
+              <w:fldChar w:fldCharType="separate"/>
+            </w:r>
+            <w:r>
+              <w:rPr>
+                <w:noProof/>
+                <w:webHidden/>
+              </w:rPr>
+              <w:t>18</w:t>
+            </w:r>
+            <w:r>
+              <w:rPr>
+                <w:noProof/>
+                <w:webHidden/>
+              </w:rPr>
+              <w:fldChar w:fldCharType="end"/>
+            </w:r>
+          </w:hyperlink>
+        </w:p>
+        <w:p>
+          <w:pPr>
+            <w:pStyle w:val="TOC1"/>
+            <w:tabs>
+              <w:tab w:val="left" w:pos="480"/>
+              <w:tab w:val="right" w:leader="dot" w:pos="9350"/>
+            </w:tabs>
+            <w:rPr>
+              <w:rFonts w:eastAsiaTheme="minorEastAsia"/>
+              <w:noProof/>
+              <w:sz w:val="24"/>
+              <w:szCs w:val="24"/>
+              <w:lang w:val="en-US"/>
+            </w:rPr>
+          </w:pPr>
+          <w:hyperlink w:anchor="_Toc230018372" w:history="1">
+            <w:r>
+              <w:rPr>
+                <w:rStyle w:val="Hyperlink"/>
+                <w:noProof/>
+              </w:rPr>
+              <w:t>7.</w:t>
+            </w:r>
+            <w:r>
+              <w:rPr>
+                <w:rFonts w:eastAsiaTheme="minorEastAsia"/>
+                <w:noProof/>
+                <w:sz w:val="24"/>
+                <w:szCs w:val="24"/>
+                <w:lang w:val="en-US"/>
+              </w:rPr>
+              <w:tab/>
+            </w:r>
+            <w:r>
+              <w:rPr>
+                <w:rStyle w:val="Hyperlink"/>
+                <w:noProof/>
+              </w:rPr>
+              <w:t>User manual</w:t>
+            </w:r>
+            <w:r>
+              <w:rPr>
+                <w:noProof/>
+                <w:webHidden/>
+              </w:rPr>
+              <w:tab/>
+            </w:r>
+            <w:r>
+              <w:rPr>
+                <w:noProof/>
+                <w:webHidden/>
+              </w:rPr>
+              <w:fldChar w:fldCharType="begin"/>
+            </w:r>
+            <w:r>
+              <w:rPr>
+                <w:noProof/>
+                <w:webHidden/>
+              </w:rPr>
+              <w:instrText xml:space="preserve"> PAGEREF _Toc230018372 \h </w:instrText>
+            </w:r>
+            <w:r>
+              <w:rPr>
+                <w:noProof/>
+                <w:webHidden/>
+              </w:rPr>
+            </w:r>
+            <w:r>
+              <w:rPr>
+                <w:noProof/>
+                <w:webHidden/>
+              </w:rPr>
+              <w:fldChar w:fldCharType="separate"/>
+            </w:r>
+            <w:r>
+              <w:rPr>
+                <w:noProof/>
+                <w:webHidden/>
+              </w:rPr>
+              <w:t>19</w:t>
             </w:r>
             <w:r>
               <w:rPr>
@@ -1986,7 +2708,7 @@
           <w:numId w:val="3"/>
         </w:numPr>
       </w:pPr>
-      <w:bookmarkStart w:id="0" w:name="_Toc229954869"/>
+      <w:bookmarkStart w:id="0" w:name="_Toc230018347"/>
       <w:r>
         <w:lastRenderedPageBreak/>
         <w:t>Introduction</w:t>
@@ -2119,7 +2841,7 @@
           <w:numId w:val="3"/>
         </w:numPr>
       </w:pPr>
-      <w:bookmarkStart w:id="1" w:name="_Toc229954870"/>
+      <w:bookmarkStart w:id="1" w:name="_Toc230018348"/>
       <w:r>
         <w:lastRenderedPageBreak/>
         <w:t>Requirements analysis</w:t>
@@ -2130,7 +2852,7 @@
       <w:pPr>
         <w:pStyle w:val="Heading2"/>
       </w:pPr>
-      <w:bookmarkStart w:id="2" w:name="_Toc229954871"/>
+      <w:bookmarkStart w:id="2" w:name="_Toc230018349"/>
       <w:r>
         <w:t>2.1 Functional and Non-Functional requirements</w:t>
       </w:r>
@@ -2816,7 +3538,7 @@
       <w:pPr>
         <w:pStyle w:val="Heading2"/>
       </w:pPr>
-      <w:bookmarkStart w:id="3" w:name="_Toc229954872"/>
+      <w:bookmarkStart w:id="3" w:name="_Toc230018350"/>
       <w:r>
         <w:lastRenderedPageBreak/>
         <w:t>2.2 Use case diagram</w:t>
@@ -2860,7 +3582,7 @@
                     <pic:cNvPicPr/>
                   </pic:nvPicPr>
                   <pic:blipFill>
-                    <a:blip r:embed="rId7">
+                    <a:blip r:embed="rId9">
                       <a:extLst>
                         <a:ext uri="{28A0092B-C50C-407E-A947-70E740481C1C}">
                           <a14:useLocalDpi xmlns:a14="http://schemas.microsoft.com/office/drawing/2010/main" val="0"/>
@@ -2898,7 +3620,7 @@
           <w:numId w:val="3"/>
         </w:numPr>
       </w:pPr>
-      <w:bookmarkStart w:id="4" w:name="_Toc229954873"/>
+      <w:bookmarkStart w:id="4" w:name="_Toc230018351"/>
       <w:r>
         <w:lastRenderedPageBreak/>
         <w:t>Architectural design</w:t>
@@ -2913,7 +3635,7 @@
           <w:numId w:val="3"/>
         </w:numPr>
       </w:pPr>
-      <w:bookmarkStart w:id="5" w:name="_Toc229954874"/>
+      <w:bookmarkStart w:id="5" w:name="_Toc230018352"/>
       <w:r>
         <w:t>Architecture overview</w:t>
       </w:r>
@@ -2952,7 +3674,7 @@
           <w:numId w:val="3"/>
         </w:numPr>
       </w:pPr>
-      <w:bookmarkStart w:id="6" w:name="_Toc229954875"/>
+      <w:bookmarkStart w:id="6" w:name="_Toc230018353"/>
       <w:r>
         <w:lastRenderedPageBreak/>
         <w:t>Component diagram</w:t>
@@ -2980,7 +3702,7 @@
                     <pic:cNvPicPr/>
                   </pic:nvPicPr>
                   <pic:blipFill>
-                    <a:blip r:embed="rId8">
+                    <a:blip r:embed="rId10">
                       <a:extLst>
                         <a:ext uri="{28A0092B-C50C-407E-A947-70E740481C1C}">
                           <a14:useLocalDpi xmlns:a14="http://schemas.microsoft.com/office/drawing/2010/main" val="0"/>
@@ -3020,7 +3742,7 @@
           <w:numId w:val="3"/>
         </w:numPr>
       </w:pPr>
-      <w:bookmarkStart w:id="7" w:name="_Toc229954876"/>
+      <w:bookmarkStart w:id="7" w:name="_Toc230018354"/>
       <w:r>
         <w:t>Design rationale</w:t>
       </w:r>
@@ -3033,7 +3755,15 @@
     </w:p>
     <w:p>
       <w:r>
-        <w:t>Alternative architectures such as ZooKeeper and Amazon SQS were considered, but as this is a simple game with only one authoritative server on a local area network, ZeroMQ was chosen for its simplicity.</w:t>
+        <w:t xml:space="preserve">Alternative architectures such as </w:t>
+      </w:r>
+      <w:proofErr w:type="spellStart"/>
+      <w:r>
+        <w:t>ZooKeeper</w:t>
+      </w:r>
+      <w:proofErr w:type="spellEnd"/>
+      <w:r>
+        <w:t xml:space="preserve"> and Amazon SQS were considered, but as this is a simple game with only one authoritative server on a local area network, ZeroMQ was chosen for its simplicity.</w:t>
       </w:r>
     </w:p>
     <w:p>
@@ -3059,7 +3789,7 @@
           <w:numId w:val="3"/>
         </w:numPr>
       </w:pPr>
-      <w:bookmarkStart w:id="8" w:name="_Toc229954877"/>
+      <w:bookmarkStart w:id="8" w:name="_Toc230018355"/>
       <w:r>
         <w:t>Consistency model</w:t>
       </w:r>
@@ -3191,7 +3921,7 @@
           <w:numId w:val="3"/>
         </w:numPr>
       </w:pPr>
-      <w:bookmarkStart w:id="9" w:name="_Toc229954878"/>
+      <w:bookmarkStart w:id="9" w:name="_Toc230018356"/>
       <w:r>
         <w:lastRenderedPageBreak/>
         <w:t>High-level class diagram</w:t>
@@ -3220,7 +3950,7 @@
                     <pic:cNvPicPr/>
                   </pic:nvPicPr>
                   <pic:blipFill>
-                    <a:blip r:embed="rId9">
+                    <a:blip r:embed="rId11">
                       <a:extLst>
                         <a:ext uri="{28A0092B-C50C-407E-A947-70E740481C1C}">
                           <a14:useLocalDpi xmlns:a14="http://schemas.microsoft.com/office/drawing/2010/main" val="0"/>
@@ -3273,7 +4003,7 @@
           <w:numId w:val="3"/>
         </w:numPr>
       </w:pPr>
-      <w:bookmarkStart w:id="10" w:name="_Toc229954879"/>
+      <w:bookmarkStart w:id="10" w:name="_Toc230018357"/>
       <w:r>
         <w:lastRenderedPageBreak/>
         <w:t>Sequence diagram</w:t>
@@ -3312,7 +4042,7 @@
                     <pic:cNvPicPr/>
                   </pic:nvPicPr>
                   <pic:blipFill>
-                    <a:blip r:embed="rId10">
+                    <a:blip r:embed="rId12">
                       <a:extLst>
                         <a:ext uri="{28A0092B-C50C-407E-A947-70E740481C1C}">
                           <a14:useLocalDpi xmlns:a14="http://schemas.microsoft.com/office/drawing/2010/main" val="0"/>
@@ -3350,7 +4080,7 @@
           <w:numId w:val="3"/>
         </w:numPr>
       </w:pPr>
-      <w:bookmarkStart w:id="11" w:name="_Toc229954880"/>
+      <w:bookmarkStart w:id="11" w:name="_Toc230018358"/>
       <w:r>
         <w:lastRenderedPageBreak/>
         <w:t>Redesign</w:t>
@@ -3381,7 +4111,7 @@
           <w:numId w:val="3"/>
         </w:numPr>
       </w:pPr>
-      <w:bookmarkStart w:id="12" w:name="_Toc229954881"/>
+      <w:bookmarkStart w:id="12" w:name="_Toc230018359"/>
       <w:r>
         <w:lastRenderedPageBreak/>
         <w:t>Test plan</w:t>
@@ -3396,7 +4126,7 @@
           <w:numId w:val="3"/>
         </w:numPr>
       </w:pPr>
-      <w:bookmarkStart w:id="13" w:name="_Toc229954882"/>
+      <w:bookmarkStart w:id="13" w:name="_Toc230018360"/>
       <w:r>
         <w:t>Test plan overview</w:t>
       </w:r>
@@ -3434,7 +4164,7 @@
         <w:ind w:left="1080"/>
       </w:pPr>
       <w:bookmarkStart w:id="14" w:name="_Ref229954740"/>
-      <w:bookmarkStart w:id="15" w:name="_Toc229954883"/>
+      <w:bookmarkStart w:id="15" w:name="_Toc230018361"/>
       <w:r>
         <w:t>Fault tests</w:t>
       </w:r>
@@ -3765,7 +4495,7 @@
           <w:numId w:val="3"/>
         </w:numPr>
       </w:pPr>
-      <w:bookmarkStart w:id="16" w:name="_Toc229954884"/>
+      <w:bookmarkStart w:id="16" w:name="_Toc230018362"/>
       <w:r>
         <w:t>Testing approach</w:t>
       </w:r>
@@ -3795,7 +4525,7 @@
           <w:numId w:val="3"/>
         </w:numPr>
       </w:pPr>
-      <w:bookmarkStart w:id="17" w:name="_Toc229954885"/>
+      <w:bookmarkStart w:id="17" w:name="_Toc230018363"/>
       <w:r>
         <w:t xml:space="preserve">Client disconnect </w:t>
       </w:r>
@@ -3830,7 +4560,7 @@
                     <pic:cNvPicPr/>
                   </pic:nvPicPr>
                   <pic:blipFill>
-                    <a:blip r:embed="rId11">
+                    <a:blip r:embed="rId13">
                       <a:extLst>
                         <a:ext uri="{28A0092B-C50C-407E-A947-70E740481C1C}">
                           <a14:useLocalDpi xmlns:a14="http://schemas.microsoft.com/office/drawing/2010/main" val="0"/>
@@ -3878,7 +4608,7 @@
           <w:numId w:val="3"/>
         </w:numPr>
       </w:pPr>
-      <w:bookmarkStart w:id="18" w:name="_Toc229954886"/>
+      <w:bookmarkStart w:id="18" w:name="_Toc230018364"/>
       <w:r>
         <w:lastRenderedPageBreak/>
         <w:t xml:space="preserve">Communication delay </w:t>
@@ -3917,7 +4647,7 @@
                     <pic:cNvPicPr/>
                   </pic:nvPicPr>
                   <pic:blipFill>
-                    <a:blip r:embed="rId12">
+                    <a:blip r:embed="rId14">
                       <a:extLst>
                         <a:ext uri="{28A0092B-C50C-407E-A947-70E740481C1C}">
                           <a14:useLocalDpi xmlns:a14="http://schemas.microsoft.com/office/drawing/2010/main" val="0"/>
@@ -3958,7 +4688,7 @@
           <w:numId w:val="3"/>
         </w:numPr>
       </w:pPr>
-      <w:bookmarkStart w:id="19" w:name="_Toc229954887"/>
+      <w:bookmarkStart w:id="19" w:name="_Toc230018365"/>
       <w:r>
         <w:lastRenderedPageBreak/>
         <w:t>Test results</w:t>
@@ -3999,7 +4729,7 @@
           <w:iCs/>
           <w:u w:val="single"/>
         </w:rPr>
-        <w:instrText xml:space="preserve"> REF _Ref229954740 \h </w:instrText>
+        <w:instrText xml:space="preserve"> REF _Ref229954740 \h  \* MERGEFORMAT </w:instrText>
       </w:r>
       <w:r>
         <w:rPr>
@@ -4007,7 +4737,6 @@
           <w:iCs/>
           <w:u w:val="single"/>
         </w:rPr>
-        <w:instrText xml:space="preserve"> \* MERGEFORMAT </w:instrText>
       </w:r>
       <w:r>
         <w:rPr>
@@ -4015,6 +4744,7 @@
           <w:iCs/>
           <w:u w:val="single"/>
         </w:rPr>
+        <w:fldChar w:fldCharType="separate"/>
       </w:r>
       <w:r>
         <w:rPr>
@@ -4022,7 +4752,7 @@
           <w:iCs/>
           <w:u w:val="single"/>
         </w:rPr>
-        <w:fldChar w:fldCharType="separate"/>
+        <w:t>Fault tests</w:t>
       </w:r>
       <w:r>
         <w:rPr>
@@ -4030,30 +4760,6 @@
           <w:iCs/>
           <w:u w:val="single"/>
         </w:rPr>
-        <w:t xml:space="preserve">Fault </w:t>
-      </w:r>
-      <w:r>
-        <w:rPr>
-          <w:i/>
-          <w:iCs/>
-          <w:u w:val="single"/>
-        </w:rPr>
-        <w:t>t</w:t>
-      </w:r>
-      <w:r>
-        <w:rPr>
-          <w:i/>
-          <w:iCs/>
-          <w:u w:val="single"/>
-        </w:rPr>
-        <w:t>ests</w:t>
-      </w:r>
-      <w:r>
-        <w:rPr>
-          <w:i/>
-          <w:iCs/>
-          <w:u w:val="single"/>
-        </w:rPr>
         <w:fldChar w:fldCharType="end"/>
       </w:r>
       <w:r>
@@ -4063,25 +4769,62 @@
     <w:p/>
     <w:p>
       <w:pPr>
-        <w:pStyle w:val="ListParagraph"/>
-        <w:numPr>
-          <w:ilvl w:val="1"/>
-          <w:numId w:val="3"/>
-        </w:numPr>
-      </w:pPr>
-      <w:r>
-        <w:t>Test result T1</w:t>
-      </w:r>
+        <w:pStyle w:val="Heading2"/>
+        <w:rPr>
+          <w:color w:val="auto"/>
+          <w:sz w:val="28"/>
+          <w:szCs w:val="28"/>
+        </w:rPr>
+      </w:pPr>
+      <w:bookmarkStart w:id="20" w:name="_Toc230018366"/>
+      <w:r>
+        <w:rPr>
+          <w:color w:val="auto"/>
+          <w:sz w:val="28"/>
+          <w:szCs w:val="28"/>
+        </w:rPr>
+        <w:t xml:space="preserve">6.1 </w:t>
+      </w:r>
+      <w:r>
+        <w:rPr>
+          <w:color w:val="auto"/>
+          <w:sz w:val="28"/>
+          <w:szCs w:val="28"/>
+        </w:rPr>
+        <w:t>T1</w:t>
+      </w:r>
+      <w:r>
+        <w:rPr>
+          <w:color w:val="auto"/>
+          <w:sz w:val="28"/>
+          <w:szCs w:val="28"/>
+        </w:rPr>
+        <w:tab/>
+      </w:r>
+      <w:r>
+        <w:rPr>
+          <w:color w:val="auto"/>
+          <w:sz w:val="28"/>
+          <w:szCs w:val="28"/>
+        </w:rPr>
+        <w:t xml:space="preserve">- </w:t>
+      </w:r>
+      <w:r>
+        <w:rPr>
+          <w:color w:val="auto"/>
+          <w:sz w:val="28"/>
+          <w:szCs w:val="28"/>
+        </w:rPr>
+        <w:t>Multiple client connection</w:t>
+      </w:r>
+      <w:bookmarkEnd w:id="20"/>
     </w:p>
     <w:p>
       <w:r>
         <w:t>For this test I have used</w:t>
       </w:r>
       <w:r>
-        <w:t xml:space="preserve"> </w:t>
-      </w:r>
-      <w:r>
-        <w:t>one player connection to get a graphical interface of the game and three bots. The result is quite clear. All the clients can connect and the game operates as expected. Everyone received the same continues game updates.</w:t>
+        <w:t xml:space="preserve"> one player connection to get a graphical interface of the game and three bots. The result is quite clear. All the clients can connect and the game operates as expected. Everyone received the same continues game updates.</w:t>
       </w:r>
     </w:p>
     <w:p>
@@ -4090,7 +4833,7 @@
           <w:noProof/>
         </w:rPr>
         <w:drawing>
-          <wp:inline distT="0" distB="0" distL="0" distR="0" wp14:anchorId="08659EC0" wp14:editId="362EA639">
+          <wp:inline distT="0" distB="0" distL="0" distR="0" wp14:anchorId="5259FFEC" wp14:editId="61BBF1A6">
             <wp:extent cx="5943600" cy="1919605"/>
             <wp:effectExtent l="0" t="0" r="0" b="4445"/>
             <wp:docPr id="674136708" name="Picture 1"/>
@@ -4105,7 +4848,7 @@
                     <pic:cNvPicPr/>
                   </pic:nvPicPr>
                   <pic:blipFill>
-                    <a:blip r:embed="rId13"/>
+                    <a:blip r:embed="rId15"/>
                     <a:stretch>
                       <a:fillRect/>
                     </a:stretch>
@@ -4128,28 +4871,68 @@
     </w:p>
     <w:p>
       <w:pPr>
-        <w:pStyle w:val="ListParagraph"/>
-        <w:numPr>
-          <w:ilvl w:val="1"/>
-          <w:numId w:val="3"/>
-        </w:numPr>
-      </w:pPr>
-      <w:r>
-        <w:t>Test result T2</w:t>
-      </w:r>
-    </w:p>
-    <w:p>
-      <w:r>
-        <w:t xml:space="preserve">For this test, I used two actual players, to have two graphical interfaces and two bots. </w:t>
-      </w:r>
-      <w:r>
-        <w:t>This worked as expected as well, all clients can move simultaneously without any issues arising.</w:t>
-      </w:r>
-    </w:p>
-    <w:p>
-      <w:r>
+        <w:pStyle w:val="Heading2"/>
+        <w:rPr>
+          <w:color w:val="auto"/>
+          <w:sz w:val="28"/>
+          <w:szCs w:val="28"/>
+        </w:rPr>
+      </w:pPr>
+      <w:bookmarkStart w:id="21" w:name="_Toc230018367"/>
+      <w:r>
+        <w:rPr>
+          <w:color w:val="auto"/>
+          <w:sz w:val="28"/>
+          <w:szCs w:val="28"/>
+        </w:rPr>
+        <w:t xml:space="preserve">6.2 </w:t>
+      </w:r>
+      <w:r>
+        <w:rPr>
+          <w:color w:val="auto"/>
+          <w:sz w:val="28"/>
+          <w:szCs w:val="28"/>
+        </w:rPr>
+        <w:t>T2</w:t>
+      </w:r>
+      <w:r>
+        <w:rPr>
+          <w:color w:val="auto"/>
+          <w:sz w:val="28"/>
+          <w:szCs w:val="28"/>
+        </w:rPr>
+        <w:tab/>
+      </w:r>
+      <w:r>
+        <w:rPr>
+          <w:color w:val="auto"/>
+          <w:sz w:val="28"/>
+          <w:szCs w:val="28"/>
+        </w:rPr>
+        <w:t xml:space="preserve">- </w:t>
+      </w:r>
+      <w:r>
+        <w:rPr>
+          <w:color w:val="auto"/>
+          <w:sz w:val="28"/>
+          <w:szCs w:val="28"/>
+        </w:rPr>
+        <w:t>Concurrent movement</w:t>
+      </w:r>
+      <w:bookmarkEnd w:id="21"/>
+    </w:p>
+    <w:p>
+      <w:r>
+        <w:t>For this test, I used two actual players, to have two graphical interfaces and two bots. This worked as expected as well, all clients can move simultaneously without any issues arising.</w:t>
+      </w:r>
+    </w:p>
+    <w:p>
+      <w:r>
+        <w:rPr>
+          <w:noProof/>
+        </w:rPr>
         <w:drawing>
-          <wp:inline distT="0" distB="0" distL="0" distR="0" wp14:anchorId="36D52722" wp14:editId="351D9263">
+          <wp:inline distT="0" distB="0" distL="0" distR="0" wp14:anchorId="0232633F" wp14:editId="6216179D">
             <wp:extent cx="5565913" cy="2305453"/>
             <wp:effectExtent l="0" t="0" r="0" b="0"/>
             <wp:docPr id="1641884642" name="Picture 1"/>
@@ -4164,7 +4947,7 @@
                     <pic:cNvPicPr/>
                   </pic:nvPicPr>
                   <pic:blipFill>
-                    <a:blip r:embed="rId14"/>
+                    <a:blip r:embed="rId16"/>
                     <a:stretch>
                       <a:fillRect/>
                     </a:stretch>
@@ -4188,29 +4971,85 @@
     <w:p/>
     <w:p>
       <w:pPr>
-        <w:pStyle w:val="ListParagraph"/>
-        <w:numPr>
-          <w:ilvl w:val="1"/>
-          <w:numId w:val="3"/>
-        </w:numPr>
-      </w:pPr>
-      <w:r>
-        <w:t>Test result T3</w:t>
-      </w:r>
-    </w:p>
-    <w:p>
-      <w:r>
-        <w:t xml:space="preserve">For this test I used the same names as during previous test. You can see that when player Bart (second player from left to right) left and his screen is no longer updated. Player Alex (first player) </w:t>
-      </w:r>
-      <w:r>
+        <w:rPr>
+          <w:rFonts w:asciiTheme="majorHAnsi" w:eastAsiaTheme="majorEastAsia" w:hAnsiTheme="majorHAnsi" w:cstheme="majorBidi"/>
+          <w:sz w:val="28"/>
+          <w:szCs w:val="28"/>
+        </w:rPr>
+      </w:pPr>
+      <w:r>
+        <w:rPr>
+          <w:sz w:val="28"/>
+          <w:szCs w:val="28"/>
+        </w:rPr>
+        <w:br w:type="page"/>
+      </w:r>
+    </w:p>
+    <w:p>
+      <w:pPr>
+        <w:pStyle w:val="Heading2"/>
+        <w:rPr>
+          <w:color w:val="auto"/>
+          <w:sz w:val="28"/>
+          <w:szCs w:val="28"/>
+        </w:rPr>
+      </w:pPr>
+      <w:bookmarkStart w:id="22" w:name="_Toc230018368"/>
+      <w:r>
+        <w:rPr>
+          <w:color w:val="auto"/>
+          <w:sz w:val="28"/>
+          <w:szCs w:val="28"/>
+        </w:rPr>
         <w:lastRenderedPageBreak/>
-        <w:t>has gathered more gold in the meanwhile and has gotten a higher score as can be seen than when Bart was still active. The result is as expected and the game continues when a client suddenly disconnects.</w:t>
-      </w:r>
-    </w:p>
-    <w:p>
-      <w:r>
+        <w:t xml:space="preserve">6.3 </w:t>
+      </w:r>
+      <w:r>
+        <w:rPr>
+          <w:color w:val="auto"/>
+          <w:sz w:val="28"/>
+          <w:szCs w:val="28"/>
+        </w:rPr>
+        <w:t>T3</w:t>
+      </w:r>
+      <w:r>
+        <w:rPr>
+          <w:color w:val="auto"/>
+          <w:sz w:val="28"/>
+          <w:szCs w:val="28"/>
+        </w:rPr>
+        <w:tab/>
+      </w:r>
+      <w:r>
+        <w:rPr>
+          <w:color w:val="auto"/>
+          <w:sz w:val="28"/>
+          <w:szCs w:val="28"/>
+        </w:rPr>
+        <w:t xml:space="preserve">- </w:t>
+      </w:r>
+      <w:r>
+        <w:rPr>
+          <w:color w:val="auto"/>
+          <w:sz w:val="28"/>
+          <w:szCs w:val="28"/>
+        </w:rPr>
+        <w:t>Client disconnection</w:t>
+      </w:r>
+      <w:bookmarkEnd w:id="22"/>
+    </w:p>
+    <w:p>
+      <w:r>
+        <w:t>For this test I used the same names as during previous test. You can see that when player Bart (second player from left to right) left and his screen is no longer updated. Player Alex (first player) has gathered more gold in the meanwhile and has gotten a higher score as can be seen than when Bart was still active. The result is as expected and the game continues when a client suddenly disconnects.</w:t>
+      </w:r>
+    </w:p>
+    <w:p>
+      <w:r>
+        <w:rPr>
+          <w:noProof/>
+        </w:rPr>
         <w:drawing>
-          <wp:inline distT="0" distB="0" distL="0" distR="0" wp14:anchorId="4EFC9578" wp14:editId="78671C98">
+          <wp:inline distT="0" distB="0" distL="0" distR="0" wp14:anchorId="0494D6EE" wp14:editId="5D061A5D">
             <wp:extent cx="5943600" cy="2469515"/>
             <wp:effectExtent l="0" t="0" r="0" b="6985"/>
             <wp:docPr id="1743118810" name="Picture 1"/>
@@ -4225,7 +5064,7 @@
                     <pic:cNvPicPr/>
                   </pic:nvPicPr>
                   <pic:blipFill>
-                    <a:blip r:embed="rId15"/>
+                    <a:blip r:embed="rId17"/>
                     <a:stretch>
                       <a:fillRect/>
                     </a:stretch>
@@ -4246,33 +5085,82 @@
         </w:drawing>
       </w:r>
     </w:p>
-    <w:p/>
-    <w:p>
-      <w:pPr>
-        <w:pStyle w:val="ListParagraph"/>
-        <w:numPr>
-          <w:ilvl w:val="1"/>
-          <w:numId w:val="3"/>
-        </w:numPr>
-      </w:pPr>
-      <w:r>
-        <w:t>Test result T4</w:t>
-      </w:r>
-    </w:p>
-    <w:p>
-      <w:r>
-        <w:t>For this test, I connected 11 bots and one player (12 clients) to one game. The game ran without any issues and operated as expected.</w:t>
-      </w:r>
-      <w:r>
-        <w:t xml:space="preserve"> The only issue that arose was that of a graphical issue, because the playing field get’s more clustered by Bs (Bots), it becomes less clear who is a bot, which one you are and where the gold is.</w:t>
-      </w:r>
-    </w:p>
-    <w:p>
-      <w:r>
+    <w:p>
+      <w:pPr>
+        <w:pStyle w:val="Heading2"/>
+        <w:rPr>
+          <w:color w:val="auto"/>
+          <w:sz w:val="28"/>
+          <w:szCs w:val="28"/>
+        </w:rPr>
+      </w:pPr>
+    </w:p>
+    <w:p>
+      <w:pPr>
+        <w:pStyle w:val="Heading2"/>
+        <w:rPr>
+          <w:color w:val="auto"/>
+          <w:sz w:val="28"/>
+          <w:szCs w:val="28"/>
+        </w:rPr>
+      </w:pPr>
+      <w:bookmarkStart w:id="23" w:name="_Toc230018369"/>
+      <w:r>
+        <w:rPr>
+          <w:color w:val="auto"/>
+          <w:sz w:val="28"/>
+          <w:szCs w:val="28"/>
+        </w:rPr>
+        <w:t xml:space="preserve">6.4 </w:t>
+      </w:r>
+      <w:r>
+        <w:rPr>
+          <w:color w:val="auto"/>
+          <w:sz w:val="28"/>
+          <w:szCs w:val="28"/>
+        </w:rPr>
+        <w:t>T4</w:t>
+      </w:r>
+      <w:r>
+        <w:rPr>
+          <w:color w:val="auto"/>
+          <w:sz w:val="28"/>
+          <w:szCs w:val="28"/>
+        </w:rPr>
+        <w:tab/>
+      </w:r>
+      <w:r>
+        <w:rPr>
+          <w:color w:val="auto"/>
+          <w:sz w:val="28"/>
+          <w:szCs w:val="28"/>
+        </w:rPr>
+        <w:t xml:space="preserve">- </w:t>
+      </w:r>
+      <w:r>
+        <w:rPr>
+          <w:color w:val="auto"/>
+          <w:sz w:val="28"/>
+          <w:szCs w:val="28"/>
+        </w:rPr>
+        <w:t>High number of participants</w:t>
+      </w:r>
+      <w:bookmarkEnd w:id="23"/>
+    </w:p>
+    <w:p>
+      <w:r>
+        <w:t>For this test, I connected 11 bots and one player (12 clients) to one game. The game ran without any issues and operated as expected. The only issue that arose was that of a graphical issue, because the playing field get’s more clustered by Bs (Bots), it becomes less clear who is a bot, which one you are and where the gold is.</w:t>
+      </w:r>
+    </w:p>
+    <w:p>
+      <w:r>
+        <w:rPr>
+          <w:noProof/>
+        </w:rPr>
         <w:drawing>
-          <wp:inline distT="0" distB="0" distL="0" distR="0" wp14:anchorId="4177B882" wp14:editId="61195D56">
-            <wp:extent cx="5943600" cy="3291840"/>
-            <wp:effectExtent l="0" t="0" r="0" b="3810"/>
+          <wp:inline distT="0" distB="0" distL="0" distR="0" wp14:anchorId="4E2E3A93" wp14:editId="5E89FC9B">
+            <wp:extent cx="5041127" cy="2792008"/>
+            <wp:effectExtent l="0" t="0" r="7620" b="8890"/>
             <wp:docPr id="257111568" name="Picture 1"/>
             <wp:cNvGraphicFramePr>
               <a:graphicFrameLocks xmlns:a="http://schemas.openxmlformats.org/drawingml/2006/main" noChangeAspect="1"/>
@@ -4285,7 +5173,7 @@
                     <pic:cNvPicPr/>
                   </pic:nvPicPr>
                   <pic:blipFill rotWithShape="1">
-                    <a:blip r:embed="rId16"/>
+                    <a:blip r:embed="rId18"/>
                     <a:srcRect b="4758"/>
                     <a:stretch>
                       <a:fillRect/>
@@ -4294,7 +5182,7 @@
                   <pic:spPr bwMode="auto">
                     <a:xfrm>
                       <a:off x="0" y="0"/>
-                      <a:ext cx="5943600" cy="3291840"/>
+                      <a:ext cx="5050780" cy="2797354"/>
                     </a:xfrm>
                     <a:prstGeom prst="rect">
                       <a:avLst/>
@@ -4318,15 +5206,55 @@
     <w:p/>
     <w:p>
       <w:pPr>
-        <w:pStyle w:val="ListParagraph"/>
-        <w:numPr>
-          <w:ilvl w:val="1"/>
-          <w:numId w:val="3"/>
-        </w:numPr>
-      </w:pPr>
-      <w:r>
-        <w:t>Test result T5</w:t>
-      </w:r>
+        <w:pStyle w:val="Heading2"/>
+        <w:rPr>
+          <w:color w:val="auto"/>
+          <w:sz w:val="28"/>
+          <w:szCs w:val="28"/>
+        </w:rPr>
+      </w:pPr>
+      <w:bookmarkStart w:id="24" w:name="_Toc230018370"/>
+      <w:r>
+        <w:rPr>
+          <w:color w:val="auto"/>
+          <w:sz w:val="28"/>
+          <w:szCs w:val="28"/>
+        </w:rPr>
+        <w:t xml:space="preserve">6.5 </w:t>
+      </w:r>
+      <w:r>
+        <w:rPr>
+          <w:color w:val="auto"/>
+          <w:sz w:val="28"/>
+          <w:szCs w:val="28"/>
+        </w:rPr>
+        <w:t>T5</w:t>
+      </w:r>
+      <w:r>
+        <w:rPr>
+          <w:color w:val="auto"/>
+          <w:sz w:val="28"/>
+          <w:szCs w:val="28"/>
+        </w:rPr>
+        <w:tab/>
+      </w:r>
+      <w:r>
+        <w:rPr>
+          <w:color w:val="auto"/>
+          <w:sz w:val="28"/>
+          <w:szCs w:val="28"/>
+        </w:rPr>
+        <w:t xml:space="preserve">- </w:t>
+      </w:r>
+      <w:r>
+        <w:rPr>
+          <w:color w:val="auto"/>
+          <w:sz w:val="28"/>
+          <w:szCs w:val="28"/>
+        </w:rPr>
+        <w:t>Consistency validation</w:t>
+      </w:r>
+      <w:bookmarkEnd w:id="24"/>
     </w:p>
     <w:p>
       <w:r>
@@ -4335,8 +5263,11 @@
     </w:p>
     <w:p>
       <w:r>
+        <w:rPr>
+          <w:noProof/>
+        </w:rPr>
         <w:drawing>
-          <wp:inline distT="0" distB="0" distL="0" distR="0" wp14:anchorId="00D8D2A0" wp14:editId="39B6A511">
+          <wp:inline distT="0" distB="0" distL="0" distR="0" wp14:anchorId="6EACB307" wp14:editId="725D02E2">
             <wp:extent cx="5943600" cy="2615565"/>
             <wp:effectExtent l="0" t="0" r="0" b="0"/>
             <wp:docPr id="1994342459" name="Picture 1"/>
@@ -4351,7 +5282,7 @@
                     <pic:cNvPicPr/>
                   </pic:nvPicPr>
                   <pic:blipFill>
-                    <a:blip r:embed="rId17"/>
+                    <a:blip r:embed="rId19"/>
                     <a:stretch>
                       <a:fillRect/>
                     </a:stretch>
@@ -4378,7 +5309,7 @@
           <w:noProof/>
         </w:rPr>
         <w:drawing>
-          <wp:inline distT="0" distB="0" distL="0" distR="0" wp14:anchorId="7045864C" wp14:editId="7A3F6C84">
+          <wp:inline distT="0" distB="0" distL="0" distR="0" wp14:anchorId="7544954E" wp14:editId="6320BF41">
             <wp:extent cx="5943600" cy="2708910"/>
             <wp:effectExtent l="0" t="0" r="0" b="0"/>
             <wp:docPr id="2056621100" name="Picture 1"/>
@@ -4393,7 +5324,7 @@
                     <pic:cNvPicPr/>
                   </pic:nvPicPr>
                   <pic:blipFill>
-                    <a:blip r:embed="rId18"/>
+                    <a:blip r:embed="rId20"/>
                     <a:stretch>
                       <a:fillRect/>
                     </a:stretch>
@@ -4421,7 +5352,7 @@
         </w:rPr>
         <w:lastRenderedPageBreak/>
         <w:drawing>
-          <wp:inline distT="0" distB="0" distL="0" distR="0" wp14:anchorId="3BC9FD28" wp14:editId="472B59B1">
+          <wp:inline distT="0" distB="0" distL="0" distR="0" wp14:anchorId="7A560C6F" wp14:editId="5227E6C6">
             <wp:extent cx="5943600" cy="2602865"/>
             <wp:effectExtent l="0" t="0" r="0" b="6985"/>
             <wp:docPr id="2117744372" name="Picture 1"/>
@@ -4436,7 +5367,7 @@
                     <pic:cNvPicPr/>
                   </pic:nvPicPr>
                   <pic:blipFill>
-                    <a:blip r:embed="rId19"/>
+                    <a:blip r:embed="rId21"/>
                     <a:stretch>
                       <a:fillRect/>
                     </a:stretch>
@@ -4459,25 +5390,101 @@
     </w:p>
     <w:p>
       <w:pPr>
-        <w:pStyle w:val="ListParagraph"/>
-        <w:numPr>
-          <w:ilvl w:val="1"/>
-          <w:numId w:val="3"/>
-        </w:numPr>
-      </w:pPr>
-      <w:r>
-        <w:t>Test result T6</w:t>
-      </w:r>
-    </w:p>
-    <w:p>
-      <w:r>
-        <w:t>For this test, I used a delayed send by one client, in this case I created an extra script (duplicate of player_client, called delayed_player_client). To emulate a slow network connection, I added a time.sleep before movements were sent. The system still picks it up and the delayed client still sees his movements. However, the client does see the delay happening on screen and the other players see that specific client moving at the same time as the client does itself.</w:t>
-      </w:r>
-    </w:p>
-    <w:p>
-      <w:r>
+        <w:rPr>
+          <w:rFonts w:asciiTheme="majorHAnsi" w:eastAsiaTheme="majorEastAsia" w:hAnsiTheme="majorHAnsi" w:cstheme="majorBidi"/>
+          <w:sz w:val="28"/>
+          <w:szCs w:val="28"/>
+        </w:rPr>
+      </w:pPr>
+    </w:p>
+    <w:p>
+      <w:pPr>
+        <w:pStyle w:val="Heading2"/>
+        <w:rPr>
+          <w:color w:val="auto"/>
+          <w:sz w:val="28"/>
+          <w:szCs w:val="28"/>
+        </w:rPr>
+      </w:pPr>
+      <w:bookmarkStart w:id="25" w:name="_Toc230018371"/>
+      <w:r>
+        <w:rPr>
+          <w:color w:val="auto"/>
+          <w:sz w:val="28"/>
+          <w:szCs w:val="28"/>
+        </w:rPr>
+        <w:t xml:space="preserve">6.6 </w:t>
+      </w:r>
+      <w:r>
+        <w:rPr>
+          <w:color w:val="auto"/>
+          <w:sz w:val="28"/>
+          <w:szCs w:val="28"/>
+        </w:rPr>
+        <w:t>T6</w:t>
+      </w:r>
+      <w:r>
+        <w:rPr>
+          <w:color w:val="auto"/>
+          <w:sz w:val="28"/>
+          <w:szCs w:val="28"/>
+        </w:rPr>
+        <w:tab/>
+      </w:r>
+      <w:r>
+        <w:rPr>
+          <w:color w:val="auto"/>
+          <w:sz w:val="28"/>
+          <w:szCs w:val="28"/>
+        </w:rPr>
+        <w:t xml:space="preserve">- </w:t>
+      </w:r>
+      <w:r>
+        <w:rPr>
+          <w:color w:val="auto"/>
+          <w:sz w:val="28"/>
+          <w:szCs w:val="28"/>
+        </w:rPr>
+        <w:t>Communication delay</w:t>
+      </w:r>
+      <w:bookmarkEnd w:id="25"/>
+    </w:p>
+    <w:p>
+      <w:r>
+        <w:t xml:space="preserve">For this test, I used a delayed send by one client, in this case I created an extra script (duplicate of </w:t>
+      </w:r>
+      <w:proofErr w:type="spellStart"/>
+      <w:r>
+        <w:t>player_client</w:t>
+      </w:r>
+      <w:proofErr w:type="spellEnd"/>
+      <w:r>
+        <w:t xml:space="preserve">, called </w:t>
+      </w:r>
+      <w:proofErr w:type="spellStart"/>
+      <w:r>
+        <w:t>delayed_player_client</w:t>
+      </w:r>
+      <w:proofErr w:type="spellEnd"/>
+      <w:r>
+        <w:t xml:space="preserve">). To emulate a slow network connection, I added a </w:t>
+      </w:r>
+      <w:proofErr w:type="spellStart"/>
+      <w:r>
+        <w:t>time.sleep</w:t>
+      </w:r>
+      <w:proofErr w:type="spellEnd"/>
+      <w:r>
+        <w:t xml:space="preserve"> before movements were sent. The system still picks it up and the delayed client still sees his movements. However, the client does see the delay happening on screen and the other players see that specific client moving at the same time as the client does itself.</w:t>
+      </w:r>
+    </w:p>
+    <w:p>
+      <w:r>
+        <w:rPr>
+          <w:noProof/>
+        </w:rPr>
         <w:drawing>
-          <wp:inline distT="0" distB="0" distL="0" distR="0" wp14:anchorId="278FE564" wp14:editId="0D5E8C43">
+          <wp:inline distT="0" distB="0" distL="0" distR="0" wp14:anchorId="5FCD1BDC" wp14:editId="5AB2B045">
             <wp:extent cx="5943600" cy="2504440"/>
             <wp:effectExtent l="0" t="0" r="0" b="0"/>
             <wp:docPr id="2024005969" name="Picture 1"/>
@@ -4492,7 +5499,7 @@
                     <pic:cNvPicPr/>
                   </pic:nvPicPr>
                   <pic:blipFill>
-                    <a:blip r:embed="rId20"/>
+                    <a:blip r:embed="rId22"/>
                     <a:stretch>
                       <a:fillRect/>
                     </a:stretch>
@@ -4516,14 +5523,439 @@
         <w:t xml:space="preserve"> </w:t>
       </w:r>
     </w:p>
+    <w:p/>
+    <w:p>
+      <w:pPr>
+        <w:rPr>
+          <w:rFonts w:asciiTheme="majorHAnsi" w:eastAsiaTheme="majorEastAsia" w:hAnsiTheme="majorHAnsi" w:cstheme="majorBidi"/>
+          <w:color w:val="0F4761" w:themeColor="accent1" w:themeShade="BF"/>
+          <w:sz w:val="40"/>
+          <w:szCs w:val="40"/>
+        </w:rPr>
+      </w:pPr>
+      <w:r>
+        <w:br w:type="page"/>
+      </w:r>
+    </w:p>
+    <w:p>
+      <w:pPr>
+        <w:pStyle w:val="Heading1"/>
+        <w:numPr>
+          <w:ilvl w:val="0"/>
+          <w:numId w:val="3"/>
+        </w:numPr>
+      </w:pPr>
+      <w:bookmarkStart w:id="26" w:name="_Toc230018372"/>
+      <w:r>
+        <w:lastRenderedPageBreak/>
+        <w:t>User manual</w:t>
+      </w:r>
+      <w:bookmarkEnd w:id="26"/>
+    </w:p>
+    <w:p/>
+    <w:p>
+      <w:r>
+        <w:t>In order to play the game, firstly download the GitHub project to your local device.</w:t>
+      </w:r>
+    </w:p>
+    <w:p>
+      <w:r>
+        <w:t>Then, if necessary, edit the config.py file to suit your needs (i.e. more players, bigger grid or different ports)</w:t>
+      </w:r>
+      <w:r>
+        <w:t>.</w:t>
+      </w:r>
+    </w:p>
+    <w:p>
+      <w:r>
+        <w:t xml:space="preserve">To start the game itself, firstly run the server.py file, which is located in the main folder of </w:t>
+      </w:r>
+      <w:proofErr w:type="spellStart"/>
+      <w:r>
+        <w:t>Goldminegame</w:t>
+      </w:r>
+      <w:proofErr w:type="spellEnd"/>
+      <w:r>
+        <w:t>. Then launch as</w:t>
+      </w:r>
+      <w:r>
+        <w:t xml:space="preserve"> many clients as needed. If you are adding a human player, make sure that you use the player_client.py file. The following is how it should be used on a windows device (</w:t>
+      </w:r>
+      <w:proofErr w:type="spellStart"/>
+      <w:r>
+        <w:t>cmd</w:t>
+      </w:r>
+      <w:proofErr w:type="spellEnd"/>
+      <w:r>
+        <w:t xml:space="preserve"> prompt).</w:t>
+      </w:r>
+    </w:p>
+    <w:p>
+      <w:r>
+        <w:t>&gt;&gt;&gt; python -u player_client.py name</w:t>
+      </w:r>
+    </w:p>
+    <w:p>
+      <w:r>
+        <w:t xml:space="preserve">Make sure to give each player an unique name as player id uses the player name and each id must be unique. If you </w:t>
+      </w:r>
+      <w:r>
+        <w:t>are playing alone, also add competition by launching a different terminal or command prompt with the following line:</w:t>
+      </w:r>
+    </w:p>
+    <w:p>
+      <w:r>
+        <w:t>&gt;&gt;&gt; python -u bot.py</w:t>
+      </w:r>
+    </w:p>
+    <w:p>
+      <w:r>
+        <w:t>A name is not necessary as a 4 digit integer will be randomly assigned to ensure all bots have an unique identifier.</w:t>
+      </w:r>
+    </w:p>
+    <w:p>
+      <w:r>
+        <w:t>The game can be played by using WASD to go in their respective directions. Q can be used to quit the game.</w:t>
+      </w:r>
+    </w:p>
+    <w:tbl>
+      <w:tblPr>
+        <w:tblStyle w:val="TableGrid"/>
+        <w:tblW w:w="0" w:type="auto"/>
+        <w:tblLook w:val="04A0" w:firstRow="1" w:lastRow="0" w:firstColumn="1" w:lastColumn="0" w:noHBand="0" w:noVBand="1"/>
+      </w:tblPr>
+      <w:tblGrid>
+        <w:gridCol w:w="1271"/>
+        <w:gridCol w:w="2116"/>
+      </w:tblGrid>
+      <w:tr>
+        <w:tc>
+          <w:tcPr>
+            <w:tcW w:w="1271" w:type="dxa"/>
+            <w:tcBorders>
+              <w:top w:val="single" w:sz="12" w:space="0" w:color="auto"/>
+              <w:left w:val="single" w:sz="12" w:space="0" w:color="auto"/>
+              <w:right w:val="single" w:sz="12" w:space="0" w:color="auto"/>
+            </w:tcBorders>
+          </w:tcPr>
+          <w:p>
+            <w:pPr>
+              <w:rPr>
+                <w:b/>
+                <w:bCs/>
+              </w:rPr>
+            </w:pPr>
+            <w:r>
+              <w:rPr>
+                <w:b/>
+                <w:bCs/>
+              </w:rPr>
+              <w:t>Letter</w:t>
+            </w:r>
+          </w:p>
+        </w:tc>
+        <w:tc>
+          <w:tcPr>
+            <w:tcW w:w="2116" w:type="dxa"/>
+            <w:tcBorders>
+              <w:top w:val="single" w:sz="12" w:space="0" w:color="auto"/>
+              <w:left w:val="single" w:sz="12" w:space="0" w:color="auto"/>
+              <w:right w:val="single" w:sz="12" w:space="0" w:color="auto"/>
+            </w:tcBorders>
+          </w:tcPr>
+          <w:p>
+            <w:pPr>
+              <w:rPr>
+                <w:b/>
+                <w:bCs/>
+              </w:rPr>
+            </w:pPr>
+            <w:r>
+              <w:rPr>
+                <w:b/>
+                <w:bCs/>
+              </w:rPr>
+              <w:t>Direction</w:t>
+            </w:r>
+            <w:r>
+              <w:rPr>
+                <w:b/>
+                <w:bCs/>
+              </w:rPr>
+              <w:t xml:space="preserve"> / Action</w:t>
+            </w:r>
+          </w:p>
+        </w:tc>
+      </w:tr>
+      <w:tr>
+        <w:tc>
+          <w:tcPr>
+            <w:tcW w:w="1271" w:type="dxa"/>
+            <w:tcBorders>
+              <w:top w:val="single" w:sz="12" w:space="0" w:color="auto"/>
+            </w:tcBorders>
+          </w:tcPr>
+          <w:p>
+            <w:r>
+              <w:t>W</w:t>
+            </w:r>
+          </w:p>
+        </w:tc>
+        <w:tc>
+          <w:tcPr>
+            <w:tcW w:w="2116" w:type="dxa"/>
+            <w:tcBorders>
+              <w:top w:val="single" w:sz="12" w:space="0" w:color="auto"/>
+            </w:tcBorders>
+          </w:tcPr>
+          <w:p>
+            <w:r>
+              <w:t>Up</w:t>
+            </w:r>
+          </w:p>
+        </w:tc>
+      </w:tr>
+      <w:tr>
+        <w:tc>
+          <w:tcPr>
+            <w:tcW w:w="1271" w:type="dxa"/>
+          </w:tcPr>
+          <w:p>
+            <w:r>
+              <w:t>A</w:t>
+            </w:r>
+          </w:p>
+        </w:tc>
+        <w:tc>
+          <w:tcPr>
+            <w:tcW w:w="2116" w:type="dxa"/>
+          </w:tcPr>
+          <w:p>
+            <w:r>
+              <w:t>Left</w:t>
+            </w:r>
+          </w:p>
+        </w:tc>
+      </w:tr>
+      <w:tr>
+        <w:tc>
+          <w:tcPr>
+            <w:tcW w:w="1271" w:type="dxa"/>
+          </w:tcPr>
+          <w:p>
+            <w:r>
+              <w:t>S</w:t>
+            </w:r>
+          </w:p>
+        </w:tc>
+        <w:tc>
+          <w:tcPr>
+            <w:tcW w:w="2116" w:type="dxa"/>
+          </w:tcPr>
+          <w:p>
+            <w:r>
+              <w:t>Down</w:t>
+            </w:r>
+          </w:p>
+        </w:tc>
+      </w:tr>
+      <w:tr>
+        <w:tc>
+          <w:tcPr>
+            <w:tcW w:w="1271" w:type="dxa"/>
+          </w:tcPr>
+          <w:p>
+            <w:r>
+              <w:t>D</w:t>
+            </w:r>
+          </w:p>
+        </w:tc>
+        <w:tc>
+          <w:tcPr>
+            <w:tcW w:w="2116" w:type="dxa"/>
+          </w:tcPr>
+          <w:p>
+            <w:r>
+              <w:t>Right</w:t>
+            </w:r>
+          </w:p>
+        </w:tc>
+      </w:tr>
+      <w:tr>
+        <w:tc>
+          <w:tcPr>
+            <w:tcW w:w="1271" w:type="dxa"/>
+          </w:tcPr>
+          <w:p>
+            <w:r>
+              <w:t>Q</w:t>
+            </w:r>
+          </w:p>
+        </w:tc>
+        <w:tc>
+          <w:tcPr>
+            <w:tcW w:w="2116" w:type="dxa"/>
+          </w:tcPr>
+          <w:p>
+            <w:r>
+              <w:t>Leave</w:t>
+            </w:r>
+          </w:p>
+        </w:tc>
+      </w:tr>
+    </w:tbl>
+    <w:p/>
+    <w:p>
+      <w:r>
+        <w:t xml:space="preserve"> </w:t>
+      </w:r>
+      <w:r>
+        <w:t xml:space="preserve">If you are finished with the game and want to restart it or either stop playing altogether, </w:t>
+      </w:r>
+      <w:r>
+        <w:rPr>
+          <w:b/>
+          <w:bCs/>
+        </w:rPr>
+        <w:t xml:space="preserve">do not forget </w:t>
+      </w:r>
+      <w:r>
+        <w:t xml:space="preserve">to </w:t>
+      </w:r>
+      <w:r>
+        <w:rPr>
+          <w:b/>
+          <w:bCs/>
+        </w:rPr>
+        <w:t>restart</w:t>
+      </w:r>
+      <w:r>
+        <w:t xml:space="preserve"> or </w:t>
+      </w:r>
+      <w:r>
+        <w:rPr>
+          <w:b/>
+          <w:bCs/>
+        </w:rPr>
+        <w:t>stop</w:t>
+      </w:r>
+      <w:r>
+        <w:t xml:space="preserve"> the server.py file. Restart it if you want a new game, stop it if you are done.</w:t>
+      </w:r>
+    </w:p>
     <w:sectPr>
+      <w:footerReference w:type="default" r:id="rId23"/>
       <w:pgSz w:w="12240" w:h="15840"/>
       <w:pgMar w:top="1440" w:right="1440" w:bottom="1440" w:left="1440" w:header="720" w:footer="720" w:gutter="0"/>
       <w:cols w:space="720"/>
+      <w:titlePg/>
       <w:docGrid w:linePitch="360"/>
     </w:sectPr>
   </w:body>
 </w:document>
+</file>
+
+<file path=word/endnotes.xml><?xml version="1.0" encoding="utf-8"?>
+<w:endnotes xmlns:wpc="http://schemas.microsoft.com/office/word/2010/wordprocessingCanvas" xmlns:cx="http://schemas.microsoft.com/office/drawing/2014/chartex" xmlns:cx1="http://schemas.microsoft.com/office/drawing/2015/9/8/chartex" xmlns:cx2="http://schemas.microsoft.com/office/drawing/2015/10/21/chartex" xmlns:cx3="http://schemas.microsoft.com/office/drawing/2016/5/9/chartex" xmlns:cx4="http://schemas.microsoft.com/office/drawing/2016/5/10/chartex" xmlns:cx5="http://schemas.microsoft.com/office/drawing/2016/5/11/chartex" xmlns:cx6="http://schemas.microsoft.com/office/drawing/2016/5/12/chartex" xmlns:cx7="http://schemas.microsoft.com/office/drawing/2016/5/13/chartex" xmlns:cx8="http://schemas.microsoft.com/office/drawing/2016/5/14/chartex" xmlns:mc="http://schemas.openxmlformats.org/markup-compatibility/2006" xmlns:aink="http://schemas.microsoft.com/office/drawing/2016/ink" xmlns:am3d="http://schemas.microsoft.com/office/drawing/2017/model3d" xmlns:o="urn:schemas-microsoft-com:office:office" xmlns:oel="http://schemas.microsoft.com/office/2019/extlst" xmlns:r="http://schemas.openxmlformats.org/officeDocument/2006/relationships" xmlns:m="http://schemas.openxmlformats.org/officeDocument/2006/math" xmlns:v="urn:schemas-microsoft-com:vml" xmlns:wp14="http://schemas.microsoft.com/office/word/2010/wordprocessingDrawing" xmlns:wp="http://schemas.openxmlformats.org/drawingml/2006/wordprocessingDrawing" xmlns:w10="urn:schemas-microsoft-com:office:word" xmlns:w="http://schemas.openxmlformats.org/wordprocessingml/2006/main" xmlns:w14="http://schemas.microsoft.com/office/word/2010/wordml" xmlns:w15="http://schemas.microsoft.com/office/word/2012/wordml" xmlns:w16cex="http://schemas.microsoft.com/office/word/2018/wordml/cex" xmlns:w16cid="http://schemas.microsoft.com/office/word/2016/wordml/cid" xmlns:w16="http://schemas.microsoft.com/office/word/2018/wordml" xmlns:w16du="http://schemas.microsoft.com/office/word/2023/wordml/word16du" xmlns:w16sdtdh="http://schemas.microsoft.com/office/word/2020/wordml/sdtdatahash" xmlns:w16sdtfl="http://schemas.microsoft.com/office/word/2024/wordml/sdtformatlock" xmlns:w16se="http://schemas.microsoft.com/office/word/2015/wordml/symex" xmlns:wpg="http://schemas.microsoft.com/office/word/2010/wordprocessingGroup" xmlns:wpi="http://schemas.microsoft.com/office/word/2010/wordprocessingInk" xmlns:wne="http://schemas.microsoft.com/office/word/2006/wordml" xmlns:wps="http://schemas.microsoft.com/office/word/2010/wordprocessingShape" mc:Ignorable="w14 w15 w16se w16cid w16 w16cex w16sdtdh w16sdtfl w16du wp14">
+  <w:endnote w:type="separator" w:id="-1">
+    <w:p>
+      <w:pPr>
+        <w:spacing w:after="0" w:line="240" w:lineRule="auto"/>
+      </w:pPr>
+      <w:r>
+        <w:separator/>
+      </w:r>
+    </w:p>
+  </w:endnote>
+  <w:endnote w:type="continuationSeparator" w:id="0">
+    <w:p>
+      <w:pPr>
+        <w:spacing w:after="0" w:line="240" w:lineRule="auto"/>
+      </w:pPr>
+      <w:r>
+        <w:continuationSeparator/>
+      </w:r>
+    </w:p>
+  </w:endnote>
+</w:endnotes>
+</file>
+
+<file path=word/footer1.xml><?xml version="1.0" encoding="utf-8"?>
+<w:ftr xmlns:wpc="http://schemas.microsoft.com/office/word/2010/wordprocessingCanvas" xmlns:cx="http://schemas.microsoft.com/office/drawing/2014/chartex" xmlns:cx1="http://schemas.microsoft.com/office/drawing/2015/9/8/chartex" xmlns:cx2="http://schemas.microsoft.com/office/drawing/2015/10/21/chartex" xmlns:cx3="http://schemas.microsoft.com/office/drawing/2016/5/9/chartex" xmlns:cx4="http://schemas.microsoft.com/office/drawing/2016/5/10/chartex" xmlns:cx5="http://schemas.microsoft.com/office/drawing/2016/5/11/chartex" xmlns:cx6="http://schemas.microsoft.com/office/drawing/2016/5/12/chartex" xmlns:cx7="http://schemas.microsoft.com/office/drawing/2016/5/13/chartex" xmlns:cx8="http://schemas.microsoft.com/office/drawing/2016/5/14/chartex" xmlns:mc="http://schemas.openxmlformats.org/markup-compatibility/2006" xmlns:aink="http://schemas.microsoft.com/office/drawing/2016/ink" xmlns:am3d="http://schemas.microsoft.com/office/drawing/2017/model3d" xmlns:o="urn:schemas-microsoft-com:office:office" xmlns:oel="http://schemas.microsoft.com/office/2019/extlst" xmlns:r="http://schemas.openxmlformats.org/officeDocument/2006/relationships" xmlns:m="http://schemas.openxmlformats.org/officeDocument/2006/math" xmlns:v="urn:schemas-microsoft-com:vml" xmlns:wp14="http://schemas.microsoft.com/office/word/2010/wordprocessingDrawing" xmlns:wp="http://schemas.openxmlformats.org/drawingml/2006/wordprocessingDrawing" xmlns:w10="urn:schemas-microsoft-com:office:word" xmlns:w="http://schemas.openxmlformats.org/wordprocessingml/2006/main" xmlns:w14="http://schemas.microsoft.com/office/word/2010/wordml" xmlns:w15="http://schemas.microsoft.com/office/word/2012/wordml" xmlns:w16cex="http://schemas.microsoft.com/office/word/2018/wordml/cex" xmlns:w16cid="http://schemas.microsoft.com/office/word/2016/wordml/cid" xmlns:w16="http://schemas.microsoft.com/office/word/2018/wordml" xmlns:w16du="http://schemas.microsoft.com/office/word/2023/wordml/word16du" xmlns:w16sdtdh="http://schemas.microsoft.com/office/word/2020/wordml/sdtdatahash" xmlns:w16sdtfl="http://schemas.microsoft.com/office/word/2024/wordml/sdtformatlock" xmlns:w16se="http://schemas.microsoft.com/office/word/2015/wordml/symex" xmlns:wpg="http://schemas.microsoft.com/office/word/2010/wordprocessingGroup" xmlns:wpi="http://schemas.microsoft.com/office/word/2010/wordprocessingInk" xmlns:wne="http://schemas.microsoft.com/office/word/2006/wordml" xmlns:wps="http://schemas.microsoft.com/office/word/2010/wordprocessingShape" mc:Ignorable="w14 w15 w16se w16cid w16 w16cex w16sdtdh w16sdtfl w16du wp14">
+  <w:sdt>
+    <w:sdtPr>
+      <w:id w:val="1132600958"/>
+      <w:docPartObj>
+        <w:docPartGallery w:val="Page Numbers (Bottom of Page)"/>
+        <w:docPartUnique/>
+      </w:docPartObj>
+    </w:sdtPr>
+    <w:sdtEndPr>
+      <w:rPr>
+        <w:noProof/>
+      </w:rPr>
+    </w:sdtEndPr>
+    <w:sdtContent>
+      <w:p>
+        <w:pPr>
+          <w:pStyle w:val="Footer"/>
+          <w:jc w:val="right"/>
+        </w:pPr>
+        <w:r>
+          <w:fldChar w:fldCharType="begin"/>
+        </w:r>
+        <w:r>
+          <w:instrText xml:space="preserve"> PAGE   \* MERGEFORMAT </w:instrText>
+        </w:r>
+        <w:r>
+          <w:fldChar w:fldCharType="separate"/>
+        </w:r>
+        <w:r>
+          <w:rPr>
+            <w:noProof/>
+          </w:rPr>
+          <w:t>2</w:t>
+        </w:r>
+        <w:r>
+          <w:rPr>
+            <w:noProof/>
+          </w:rPr>
+          <w:fldChar w:fldCharType="end"/>
+        </w:r>
+      </w:p>
+    </w:sdtContent>
+  </w:sdt>
+  <w:p>
+    <w:pPr>
+      <w:pStyle w:val="Footer"/>
+    </w:pPr>
+  </w:p>
+</w:ftr>
+</file>
+
+<file path=word/footnotes.xml><?xml version="1.0" encoding="utf-8"?>
+<w:footnotes xmlns:wpc="http://schemas.microsoft.com/office/word/2010/wordprocessingCanvas" xmlns:cx="http://schemas.microsoft.com/office/drawing/2014/chartex" xmlns:cx1="http://schemas.microsoft.com/office/drawing/2015/9/8/chartex" xmlns:cx2="http://schemas.microsoft.com/office/drawing/2015/10/21/chartex" xmlns:cx3="http://schemas.microsoft.com/office/drawing/2016/5/9/chartex" xmlns:cx4="http://schemas.microsoft.com/office/drawing/2016/5/10/chartex" xmlns:cx5="http://schemas.microsoft.com/office/drawing/2016/5/11/chartex" xmlns:cx6="http://schemas.microsoft.com/office/drawing/2016/5/12/chartex" xmlns:cx7="http://schemas.microsoft.com/office/drawing/2016/5/13/chartex" xmlns:cx8="http://schemas.microsoft.com/office/drawing/2016/5/14/chartex" xmlns:mc="http://schemas.openxmlformats.org/markup-compatibility/2006" xmlns:aink="http://schemas.microsoft.com/office/drawing/2016/ink" xmlns:am3d="http://schemas.microsoft.com/office/drawing/2017/model3d" xmlns:o="urn:schemas-microsoft-com:office:office" xmlns:oel="http://schemas.microsoft.com/office/2019/extlst" xmlns:r="http://schemas.openxmlformats.org/officeDocument/2006/relationships" xmlns:m="http://schemas.openxmlformats.org/officeDocument/2006/math" xmlns:v="urn:schemas-microsoft-com:vml" xmlns:wp14="http://schemas.microsoft.com/office/word/2010/wordprocessingDrawing" xmlns:wp="http://schemas.openxmlformats.org/drawingml/2006/wordprocessingDrawing" xmlns:w10="urn:schemas-microsoft-com:office:word" xmlns:w="http://schemas.openxmlformats.org/wordprocessingml/2006/main" xmlns:w14="http://schemas.microsoft.com/office/word/2010/wordml" xmlns:w15="http://schemas.microsoft.com/office/word/2012/wordml" xmlns:w16cex="http://schemas.microsoft.com/office/word/2018/wordml/cex" xmlns:w16cid="http://schemas.microsoft.com/office/word/2016/wordml/cid" xmlns:w16="http://schemas.microsoft.com/office/word/2018/wordml" xmlns:w16du="http://schemas.microsoft.com/office/word/2023/wordml/word16du" xmlns:w16sdtdh="http://schemas.microsoft.com/office/word/2020/wordml/sdtdatahash" xmlns:w16sdtfl="http://schemas.microsoft.com/office/word/2024/wordml/sdtformatlock" xmlns:w16se="http://schemas.microsoft.com/office/word/2015/wordml/symex" xmlns:wpg="http://schemas.microsoft.com/office/word/2010/wordprocessingGroup" xmlns:wpi="http://schemas.microsoft.com/office/word/2010/wordprocessingInk" xmlns:wne="http://schemas.microsoft.com/office/word/2006/wordml" xmlns:wps="http://schemas.microsoft.com/office/word/2010/wordprocessingShape" mc:Ignorable="w14 w15 w16se w16cid w16 w16cex w16sdtdh w16sdtfl w16du wp14">
+  <w:footnote w:type="separator" w:id="-1">
+    <w:p>
+      <w:pPr>
+        <w:spacing w:after="0" w:line="240" w:lineRule="auto"/>
+      </w:pPr>
+      <w:r>
+        <w:separator/>
+      </w:r>
+    </w:p>
+  </w:footnote>
+  <w:footnote w:type="continuationSeparator" w:id="0">
+    <w:p>
+      <w:pPr>
+        <w:spacing w:after="0" w:line="240" w:lineRule="auto"/>
+      </w:pPr>
+      <w:r>
+        <w:continuationSeparator/>
+      </w:r>
+    </w:p>
+  </w:footnote>
+</w:footnotes>
 </file>
 
 <file path=word/numbering.xml><?xml version="1.0" encoding="utf-8"?>
@@ -5405,6 +6837,7 @@
   <w:style w:type="paragraph" w:default="1" w:styleId="Normal">
     <w:name w:val="Normal"/>
     <w:qFormat/>
+    <w:rsid w:val="00D5259E"/>
     <w:rPr>
       <w:lang w:val="en-GB"/>
     </w:rPr>
@@ -5610,6 +7043,7 @@
   <w:style w:type="character" w:default="1" w:styleId="DefaultParagraphFont">
     <w:name w:val="Default Paragraph Font"/>
     <w:uiPriority w:val="1"/>
+    <w:semiHidden/>
     <w:unhideWhenUsed/>
   </w:style>
   <w:style w:type="table" w:default="1" w:styleId="TableNormal">
@@ -6010,6 +7444,56 @@
       <w:ind w:left="220"/>
     </w:pPr>
   </w:style>
+  <w:style w:type="paragraph" w:styleId="Header">
+    <w:name w:val="header"/>
+    <w:basedOn w:val="Normal"/>
+    <w:link w:val="HeaderChar"/>
+    <w:uiPriority w:val="99"/>
+    <w:unhideWhenUsed/>
+    <w:rsid w:val="002C0375"/>
+    <w:pPr>
+      <w:tabs>
+        <w:tab w:val="center" w:pos="4680"/>
+        <w:tab w:val="right" w:pos="9360"/>
+      </w:tabs>
+      <w:spacing w:after="0" w:line="240" w:lineRule="auto"/>
+    </w:pPr>
+  </w:style>
+  <w:style w:type="character" w:customStyle="1" w:styleId="HeaderChar">
+    <w:name w:val="Header Char"/>
+    <w:basedOn w:val="DefaultParagraphFont"/>
+    <w:link w:val="Header"/>
+    <w:uiPriority w:val="99"/>
+    <w:rsid w:val="002C0375"/>
+    <w:rPr>
+      <w:lang w:val="en-GB"/>
+    </w:rPr>
+  </w:style>
+  <w:style w:type="paragraph" w:styleId="Footer">
+    <w:name w:val="footer"/>
+    <w:basedOn w:val="Normal"/>
+    <w:link w:val="FooterChar"/>
+    <w:uiPriority w:val="99"/>
+    <w:unhideWhenUsed/>
+    <w:rsid w:val="002C0375"/>
+    <w:pPr>
+      <w:tabs>
+        <w:tab w:val="center" w:pos="4680"/>
+        <w:tab w:val="right" w:pos="9360"/>
+      </w:tabs>
+      <w:spacing w:after="0" w:line="240" w:lineRule="auto"/>
+    </w:pPr>
+  </w:style>
+  <w:style w:type="character" w:customStyle="1" w:styleId="FooterChar">
+    <w:name w:val="Footer Char"/>
+    <w:basedOn w:val="DefaultParagraphFont"/>
+    <w:link w:val="Footer"/>
+    <w:uiPriority w:val="99"/>
+    <w:rsid w:val="002C0375"/>
+    <w:rPr>
+      <w:lang w:val="en-GB"/>
+    </w:rPr>
+  </w:style>
 </w:styles>
 </file>
 

</xml_diff>